<commit_message>
docs: rendre valides les 222 renvois internes du dossier
Le texte renvoyait à ses propres sous-sections — « § 8.2 », « § 5.4.5 »,
« § 7.1.2 » — qui n'existent plus depuis que le dossier suit la trame : seules
les douze parties et les sous-parties de 5, 7 et 12 y sont numérotées.

Chaque renvoi est ramené au niveau le plus profond réellement présent :
§ 5.4.5 devient § 5.4, § 7.1.2 devient § 7.1, § 8.2 devient § 8. Sur 222
renvois, 59 étaient déjà valides et 163 ont été ramenés ; il n'en reste aucun
qui pointe dans le vide.

Trois renvois visaient la veille AI Act, retirée du dossier : les ramener à
« § 11 » aurait envoyé le lecteur vers un texte qui n'en parle plus. Le renvoi
est supprimé, la phrase conservée.

Co-Authored-By: Claude Opus 5 <noreply@anthropic.com>
Claude-Session: https://claude.ai/code/session_01BkfMb4UJocAE1ei2gvfyH2
</commit_message>
<xml_diff>
--- a/docs/dossier/dossier-projet-rempli.docx
+++ b/docs/dossier/dossier-projet-rempli.docx
@@ -2299,7 +2299,7 @@
               <w:jc w:val="left"/>
             </w:pPr>
             <w:r>
-              <w:t xml:space="preserve">§ 6</w:t>
+              <w:t>§ 6</w:t>
             </w:r>
           </w:p>
         </w:tc>
@@ -2373,7 +2373,7 @@
               <w:jc w:val="left"/>
             </w:pPr>
             <w:r>
-              <w:t xml:space="preserve">§ 7.1, § 12.1, § 12.2</w:t>
+              <w:t>§ 7.1, § 12.1, § 12.2</w:t>
             </w:r>
           </w:p>
         </w:tc>
@@ -2465,7 +2465,7 @@
               <w:jc w:val="left"/>
             </w:pPr>
             <w:r>
-              <w:t xml:space="preserve">§ 7.2, § 12.3</w:t>
+              <w:t>§ 7.2, § 12.3</w:t>
             </w:r>
           </w:p>
         </w:tc>
@@ -2503,7 +2503,7 @@
               <w:jc w:val="left"/>
             </w:pPr>
             <w:r>
-              <w:t xml:space="preserve">§ 4</w:t>
+              <w:t>§ 4</w:t>
             </w:r>
           </w:p>
         </w:tc>
@@ -2608,7 +2608,7 @@
               <w:jc w:val="left"/>
             </w:pPr>
             <w:r>
-              <w:t xml:space="preserve">§ 5.3, § 5.6, § 12.1</w:t>
+              <w:t>§ 5.3, § 5.6, § 12.1</w:t>
             </w:r>
           </w:p>
         </w:tc>
@@ -2646,7 +2646,7 @@
               <w:jc w:val="left"/>
             </w:pPr>
             <w:r>
-              <w:t xml:space="preserve">§ 5.2</w:t>
+              <w:t>§ 5.2</w:t>
             </w:r>
           </w:p>
         </w:tc>
@@ -2684,7 +2684,7 @@
               <w:jc w:val="left"/>
             </w:pPr>
             <w:r>
-              <w:t xml:space="preserve">§ 5.4, § 5.5</w:t>
+              <w:t>§ 5.4, § 5.5</w:t>
             </w:r>
           </w:p>
         </w:tc>
@@ -2722,7 +2722,7 @@
               <w:jc w:val="left"/>
             </w:pPr>
             <w:r>
-              <w:t xml:space="preserve">§ 7.3, § 12.4</w:t>
+              <w:t>§ 7.3, § 12.4</w:t>
             </w:r>
           </w:p>
         </w:tc>
@@ -2827,7 +2827,7 @@
               <w:jc w:val="left"/>
             </w:pPr>
             <w:r>
-              <w:t xml:space="preserve">§ 9, § 10</w:t>
+              <w:t>§ 9, § 10</w:t>
             </w:r>
           </w:p>
         </w:tc>
@@ -2865,7 +2865,7 @@
               <w:jc w:val="left"/>
             </w:pPr>
             <w:r>
-              <w:t xml:space="preserve">§ 5.5, § 6</w:t>
+              <w:t>§ 5.5, § 6</w:t>
             </w:r>
           </w:p>
         </w:tc>
@@ -2903,7 +2903,7 @@
               <w:jc w:val="left"/>
             </w:pPr>
             <w:r>
-              <w:t xml:space="preserve">§ 6</w:t>
+              <w:t>§ 6</w:t>
             </w:r>
           </w:p>
         </w:tc>
@@ -2924,7 +2924,7 @@
         <w:t xml:space="preserve"> </w:t>
       </w:r>
       <w:r>
-        <w:t xml:space="preserve">— La veille technique menée pendant le projet (§ 11) atteste de la compétence « Apprendre en continu » : elle a conduit à identifier une vulnérabilité affectant réellement le projet et une obligation réglementaire postérieure au cahier des charges. La démarche de résolution de problème est illustrée par les arbitrages techniques documentés en § 5.2 et § 6, notamment le choix d'un modèle de langage local. La lecture de la documentation technique anglophone (Flask, SQLAlchemy, Ollama, avis de sécurité GitHub et CISA, OWASP) couvre la compétence « Communiquer en français et en anglais ».</w:t>
+        <w:t>— La veille technique menée pendant le projet (§ 11) atteste de la compétence « Apprendre en continu » : elle a conduit à identifier une vulnérabilité affectant réellement le projet et une obligation réglementaire postérieure au cahier des charges. La démarche de résolution de problème est illustrée par les arbitrages techniques documentés en § 5.2 et § 6, notamment le choix d'un modèle de langage local. La lecture de la documentation technique anglophone (Flask, SQLAlchemy, Ollama, avis de sécurité GitHub et CISA, OWASP) couvre la compétence « Communiquer en français et en anglais ».</w:t>
       </w:r>
     </w:p>
     <w:p>
@@ -3338,7 +3338,7 @@
         <w:t xml:space="preserve">postérieure à la rédaction du cahier des charges</w:t>
       </w:r>
       <w:r>
-        <w:t xml:space="preserve">, s'est ajoutée en cours de projet : les obligations de transparence de l'AI Act, applicables depuis le 2 août 2026 (§ 11).</w:t>
+        <w:t>, s'est ajoutée en cours de projet : les obligations de transparence de l'AI Act, applicables depuis le 2 août 2026 (§ 11).</w:t>
       </w:r>
     </w:p>
     <w:bookmarkEnd w:id="25"/>
@@ -3383,7 +3383,7 @@
         <w:pStyle w:val="BodyText"/>
       </w:pPr>
       <w:r>
-        <w:t xml:space="preserve">Deux écarts assumés par rapport à cette recommandation sont justifiés en § 5.2 : l'usage de</w:t>
+        <w:t>Deux écarts assumés par rapport à cette recommandation sont justifiés en § 5.2 : l'usage de</w:t>
       </w:r>
       <w:r>
         <w:t xml:space="preserve"> </w:t>
@@ -4392,7 +4392,7 @@
               <w:jc w:val="left"/>
             </w:pPr>
             <w:r>
-              <w:t xml:space="preserve">Terminé (§ 8)</w:t>
+              <w:t>Terminé (§ 8)</w:t>
             </w:r>
           </w:p>
         </w:tc>
@@ -4418,7 +4418,7 @@
               <w:jc w:val="left"/>
             </w:pPr>
             <w:r>
-              <w:t xml:space="preserve">Terminé (§ 11)</w:t>
+              <w:t>Terminé (§ 11)</w:t>
             </w:r>
           </w:p>
         </w:tc>
@@ -4444,7 +4444,7 @@
               <w:jc w:val="left"/>
             </w:pPr>
             <w:r>
-              <w:t>Terminée (§ 11.5) — DOMPurify 3.4.16, Ollama 0.35.1</w:t>
+              <w:t>Terminée (§ 11) — DOMPurify 3.4.16, Ollama 0.35.1</w:t>
             </w:r>
           </w:p>
         </w:tc>
@@ -4470,7 +4470,7 @@
               <w:jc w:val="left"/>
             </w:pPr>
             <w:r>
-              <w:t xml:space="preserve">À faire (§ 11.4)</w:t>
+              <w:t>À faire (§ 11)</w:t>
             </w:r>
           </w:p>
         </w:tc>
@@ -4496,7 +4496,7 @@
               <w:jc w:val="left"/>
             </w:pPr>
             <w:r>
-              <w:t xml:space="preserve">Terminé (§ 9, § 10)</w:t>
+              <w:t>Terminé (§ 9, § 10)</w:t>
             </w:r>
           </w:p>
         </w:tc>
@@ -4522,7 +4522,7 @@
               <w:jc w:val="left"/>
             </w:pPr>
             <w:r>
-              <w:t>Terminé — 195 cas au vert, 95 % de couverture backend (§ 9.8)</w:t>
+              <w:t>Terminé — 195 cas au vert, 95 % de couverture backend (§ 9)</w:t>
             </w:r>
           </w:p>
         </w:tc>
@@ -4548,7 +4548,7 @@
               <w:jc w:val="left"/>
             </w:pPr>
             <w:r>
-              <w:t>Terminées — Docker Compose (MySQL 8.4, backend, frontend) et pipeline GitHub Actions à trois travaux (§ 6.6)</w:t>
+              <w:t>Terminées — Docker Compose (MySQL 8.4, backend, frontend) et pipeline GitHub Actions à trois travaux (§ 6)</w:t>
             </w:r>
           </w:p>
         </w:tc>
@@ -4600,7 +4600,7 @@
               <w:jc w:val="left"/>
             </w:pPr>
             <w:r>
-              <w:t>Terminés — audit d'accessibilité (axe-core) et audit de sécurité (§ 8, § 9.7)</w:t>
+              <w:t>Terminés — audit d'accessibilité (axe-core) et audit de sécurité (§ 8, § 9)</w:t>
             </w:r>
           </w:p>
         </w:tc>
@@ -4813,7 +4813,7 @@
         <w:t xml:space="preserve"> </w:t>
       </w:r>
       <w:r>
-        <w:t xml:space="preserve">(§ 11.3) a montré l'utilité : c'est lui qui permet de savoir, après coup et avec certitude, quelle version exacte d'une dépendance a été installée.</w:t>
+        <w:t>(§ 11) a montré l'utilité : c'est lui qui permet de savoir, après coup et avec certitude, quelle version exacte d'une dépendance a été installée.</w:t>
       </w:r>
     </w:p>
     <w:bookmarkEnd w:id="35"/>
@@ -4948,7 +4948,7 @@
               <w:jc w:val="left"/>
             </w:pPr>
             <w:r>
-              <w:t xml:space="preserve">§ 6, § 8</w:t>
+              <w:t>§ 6, § 8</w:t>
             </w:r>
           </w:p>
         </w:tc>
@@ -4995,7 +4995,7 @@
               <w:jc w:val="left"/>
             </w:pPr>
             <w:r>
-              <w:t xml:space="preserve">§ 5.2</w:t>
+              <w:t>§ 5.2</w:t>
             </w:r>
           </w:p>
         </w:tc>
@@ -5033,7 +5033,7 @@
               <w:jc w:val="left"/>
             </w:pPr>
             <w:r>
-              <w:t xml:space="preserve">§ 8</w:t>
+              <w:t>§ 8</w:t>
             </w:r>
           </w:p>
         </w:tc>
@@ -5071,7 +5071,7 @@
               <w:jc w:val="left"/>
             </w:pPr>
             <w:r>
-              <w:t xml:space="preserve">§ 7.3, § 8</w:t>
+              <w:t>§ 7.3, § 8</w:t>
             </w:r>
           </w:p>
         </w:tc>
@@ -5109,7 +5109,7 @@
               <w:jc w:val="left"/>
             </w:pPr>
             <w:r>
-              <w:t xml:space="preserve">§ 5.2, § 8</w:t>
+              <w:t>§ 5.2, § 8</w:t>
             </w:r>
           </w:p>
         </w:tc>
@@ -5147,7 +5147,7 @@
               <w:jc w:val="left"/>
             </w:pPr>
             <w:r>
-              <w:t xml:space="preserve">§ 6</w:t>
+              <w:t>§ 6</w:t>
             </w:r>
           </w:p>
         </w:tc>
@@ -5241,7 +5241,7 @@
         <w:t xml:space="preserve"> </w:t>
       </w:r>
       <w:r>
-        <w:t xml:space="preserve">L'envoi des textes rédigés à un service tiers était difficilement conciliable avec l'exigence RGPD du cahier des charges. Le passage à une inférence locale a supprimé le problème à la source, au prix de temps de réponse plus longs, d'un prérequis d'installation supplémentaire — et, comme la veille l'a montré (§ 11.3), d'un service de plus à tenir à jour.</w:t>
+        <w:t>L'envoi des textes rédigés à un service tiers était difficilement conciliable avec l'exigence RGPD du cahier des charges. Le passage à une inférence locale a supprimé le problème à la source, au prix de temps de réponse plus longs, d'un prérequis d'installation supplémentaire — et, comme la veille l'a montré (§ 11), d'un service de plus à tenir à jour.</w:t>
       </w:r>
     </w:p>
     <w:p>
@@ -5472,7 +5472,7 @@
         <w:t xml:space="preserve">les textes de l'interface, et les prompts, font partie des spécifications</w:t>
       </w:r>
       <w:r>
-        <w:t xml:space="preserve">, au même titre qu'une route ou un modèle de données. Ils dérivent d'autant plus facilement qu'aucun test ne les couvre, et seule une relecture confrontée au cahier des charges les rattrape. C'est la raison d'être du cas de test TU-04 du § 9.3.1, qui verrouille désormais ce point.</w:t>
+        <w:t>, au même titre qu'une route ou un modèle de données. Ils dérivent d'autant plus facilement qu'aucun test ne les couvre, et seule une relecture confrontée au cahier des charges les rattrape. C'est la raison d'être du cas de test TU-04 du § 9, qui verrouille désormais ce point.</w:t>
       </w:r>
     </w:p>
     <w:p>
@@ -5503,7 +5503,7 @@
         <w:t xml:space="preserve">une capture atteste d'un état, pas d'un comportement</w:t>
       </w:r>
       <w:r>
-        <w:t xml:space="preserve">. Vérifier une fonctionnalité demande de lire le code ou d'exécuter un scénario, pas de regarder une image fixe. C'est précisément la raison d'être du jeu d'essai documenté en § 10.</w:t>
+        <w:t>. Vérifier une fonctionnalité demande de lire le code ou d'exécuter un scénario, pas de regarder une image fixe. C'est précisément la raison d'être du jeu d'essai documenté en § 10.</w:t>
       </w:r>
     </w:p>
     <w:p>
@@ -6173,7 +6173,7 @@
               <w:jc w:val="left"/>
             </w:pPr>
             <w:r>
-              <w:t xml:space="preserve">Information de l'utilisateur sur la nature générée des propositions — partiellement couvert, complément identifié en § 11.4</w:t>
+              <w:t>Information de l'utilisateur sur la nature générée des propositions — partiellement couvert, complément identifié en § 11</w:t>
             </w:r>
           </w:p>
         </w:tc>
@@ -6530,7 +6530,7 @@
               <w:jc w:val="left"/>
             </w:pPr>
             <w:r>
-              <w:t>Livrés — docker-compose.yml, deux Dockerfile, pipeline CI (§ 6.6)</w:t>
+              <w:t>Livrés — docker-compose.yml, deux Dockerfile, pipeline CI (§ 6)</w:t>
             </w:r>
           </w:p>
         </w:tc>
@@ -6631,7 +6631,7 @@
               <w:t xml:space="preserve"> </w:t>
             </w:r>
             <w:r>
-              <w:t xml:space="preserve">(§ 11)</w:t>
+              <w:t>(§ 11)</w:t>
             </w:r>
           </w:p>
         </w:tc>
@@ -6822,7 +6822,7 @@
               <w:t xml:space="preserve"> </w:t>
             </w:r>
             <w:r>
-              <w:t xml:space="preserve">(§ 9, § 10)</w:t>
+              <w:t>(§ 9, § 10)</w:t>
             </w:r>
           </w:p>
         </w:tc>
@@ -6860,7 +6860,7 @@
               <w:jc w:val="left"/>
             </w:pPr>
             <w:r>
-              <w:t>Livré (§ 9.8)</w:t>
+              <w:t>Livré (§ 9)</w:t>
             </w:r>
           </w:p>
         </w:tc>
@@ -7038,7 +7038,7 @@
         <w:t xml:space="preserve">localhost</w:t>
       </w:r>
       <w:r>
-        <w:t xml:space="preserve">). Cette règle, initialement implicite, est devenue une consigne explicite de déploiement après la publication de CVE-2026-7482 (§ 11.3).</w:t>
+        <w:t>). Cette règle, initialement implicite, est devenue une consigne explicite de déploiement après la publication de CVE-2026-7482 (§ 11).</w:t>
       </w:r>
     </w:p>
     <w:bookmarkEnd w:id="45"/>
@@ -7325,7 +7325,7 @@
         <w:t xml:space="preserve"> </w:t>
       </w:r>
       <w:r>
-        <w:t xml:space="preserve">— est ce qui rend les composants métier testables sans démarrer de serveur. C'est le prérequis du plan de tests unitaires décrit en § 9. Une nuance sur son application réelle — l'usage de</w:t>
+        <w:t>— est ce qui rend les composants métier testables sans démarrer de serveur. C'est le prérequis du plan de tests unitaires décrit en § 9. Une nuance sur son application réelle — l'usage de</w:t>
       </w:r>
       <w:r>
         <w:t xml:space="preserve"> </w:t>
@@ -7340,7 +7340,7 @@
         <w:t xml:space="preserve"> </w:t>
       </w:r>
       <w:r>
-        <w:t xml:space="preserve">pour lire la configuration — est apportée en § 7.2.4.</w:t>
+        <w:t>pour lire la configuration — est apportée en § 7.2.</w:t>
       </w:r>
     </w:p>
     <w:p>
@@ -7860,7 +7860,7 @@
           <w:bCs/>
           <w:b/>
         </w:rPr>
-        <w:t>Ollama en local plutôt que l'API OpenAI. Le cahier des charges autorise explicitement les deux. L'exigence RGPD — aucune donnée personnelle transmise à OpenAI sans anonymisation — est difficile à garantir sur des textes rédigés librement par l'utilisateur, où l'anonymisation ne peut jamais être exhaustive. En hébergeant le modèle qwen2.5:3b localement, les contenus ne quittent pas l'infrastructure : l'exigence est satisfaite par construction plutôt que par filtrage. Aucune clé d'API n'est nécessaire, donc aucun secret de facturation à protéger. Contreparties assumées : latence plus élevée, qualité de sortie inférieure à GPT-4, prérequis d'installation d'Ollama, et maintenance d'un service supplémentaire — la veille a confirmé que ce dernier point n'est pas théorique (§ 11.3). La couche ia_service isole l'appel au modèle, ce qui permettrait de basculer vers un fournisseur distant sans toucher aux routes.</w:t>
+        <w:t>Ollama en local plutôt que l'API OpenAI. Le cahier des charges autorise explicitement les deux. L'exigence RGPD — aucune donnée personnelle transmise à OpenAI sans anonymisation — est difficile à garantir sur des textes rédigés librement par l'utilisateur, où l'anonymisation ne peut jamais être exhaustive. En hébergeant le modèle qwen2.5:3b localement, les contenus ne quittent pas l'infrastructure : l'exigence est satisfaite par construction plutôt que par filtrage. Aucune clé d'API n'est nécessaire, donc aucun secret de facturation à protéger. Contreparties assumées : latence plus élevée, qualité de sortie inférieure à GPT-4, prérequis d'installation d'Ollama, et maintenance d'un service supplémentaire — la veille a confirmé que ce dernier point n'est pas théorique (§ 11). La couche ia_service isole l'appel au modèle, ce qui permettrait de basculer vers un fournisseur distant sans toucher aux routes.</w:t>
       </w:r>
     </w:p>
     <w:p>
@@ -7894,7 +7894,7 @@
         <w:t xml:space="preserve"> </w:t>
       </w:r>
       <w:r>
-        <w:t xml:space="preserve">de la bibliothèque d'assainissement — argument qui a pris du poids quand la veille a révélé une vulnérabilité dans DOMPurify elle-même (§ 11.3).</w:t>
+        <w:t>de la bibliothèque d'assainissement — argument qui a pris du poids quand la veille a révélé une vulnérabilité dans DOMPurify elle-même (§ 11).</w:t>
       </w:r>
     </w:p>
     <w:p>
@@ -8084,7 +8084,7 @@
         <w:pStyle w:val="FirstParagraph"/>
       </w:pPr>
       <w:r>
-        <w:t xml:space="preserve">Le dossier de maquettage s'est construit en trois temps : recensement des écrans nécessaires à partir du périmètre fonctionnel du cahier des charges (§ 2.3), définition de la charte graphique et des composants récurrents, puis formalisation de l'enchaînement des écrans sous forme de schéma.</w:t>
+        <w:t>Le dossier de maquettage s'est construit en trois temps : recensement des écrans nécessaires à partir du périmètre fonctionnel du cahier des charges (§ 2), définition de la charte graphique et des composants récurrents, puis formalisation de l'enchaînement des écrans sous forme de schéma.</w:t>
       </w:r>
     </w:p>
     <w:p>
@@ -8108,7 +8108,7 @@
         <w:t xml:space="preserve"> </w:t>
       </w:r>
       <w:r>
-        <w:t xml:space="preserve">: blocs, libellés et hiérarchie, sans couleur ni typographie définitive. Ce niveau de détail est délibéré. Une maquette qui ressemble déjà au produit fini déplace la discussion vers l'apparence, alors que ce qui doit être arrêté à ce stade est la composition : quelles informations sur quel écran, dans quel ordre, atteignables depuis où. La charte graphique est traitée séparément (§ 5.3.2), et le rendu final relève des captures d'écran (§ 7.1).</w:t>
+        <w:t>: blocs, libellés et hiérarchie, sans couleur ni typographie définitive. Ce niveau de détail est délibéré. Une maquette qui ressemble déjà au produit fini déplace la discussion vers l'apparence, alors que ce qui doit être arrêté à ce stade est la composition : quelles informations sur quel écran, dans quel ordre, atteignables depuis où. La charte graphique est traitée séparément (§ 5.3), et le rendu final relève des captures d'écran (§ 7.1).</w:t>
       </w:r>
     </w:p>
     <w:p>
@@ -9639,7 +9639,7 @@
           <w:iCs/>
           <w:i/>
         </w:rPr>
-        <w:t xml:space="preserve">La version mise au propre de ce schéma constitue la planche W-09 (annexe § 12.1).</w:t>
+        <w:t>La version mise au propre de ce schéma constitue la planche W-09 (annexe § 12.1).</w:t>
       </w:r>
     </w:p>
     <w:p>
@@ -9728,7 +9728,7 @@
         <w:t xml:space="preserve"> </w:t>
       </w:r>
       <w:r>
-        <w:t xml:space="preserve">du routeur double ce masquage, et le backend revérifie le rôle en base à chaque appel (§ 5.2.5). Masquer un lien n'est pas une mesure de sécurité, c'est un confort d'usage — le contrôle réel est côté serveur.</w:t>
+        <w:t>du routeur double ce masquage, et le backend revérifie le rôle en base à chaque appel (§ 5.2). Masquer un lien n'est pas une mesure de sécurité, c'est un confort d'usage — le contrôle réel est côté serveur.</w:t>
       </w:r>
     </w:p>
     <w:p>
@@ -10041,7 +10041,7 @@
         <w:t xml:space="preserve"> </w:t>
       </w:r>
       <w:r>
-        <w:t xml:space="preserve">— trois états possibles : « Enregistrement… », « ✓ Enregistré automatiquement », et un message d'échec invitant à enregistrer manuellement. L'emplacement est réservé en permanence dans la mise en page, pour que l'apparition du message ne décale pas le contenu sous lui. Le mécanisme est détaillé en § 7.1.</w:t>
+        <w:t>— trois états possibles : « Enregistrement… », « ✓ Enregistré automatiquement », et un message d'échec invitant à enregistrer manuellement. L'emplacement est réservé en permanence dans la mise en page, pour que l'apparition du message ne décale pas le contenu sous lui. Le mécanisme est détaillé en § 7.1.</w:t>
       </w:r>
     </w:p>
     <w:p>
@@ -10134,7 +10134,7 @@
         <w:t xml:space="preserve"> </w:t>
       </w:r>
       <w:r>
-        <w:t xml:space="preserve">— section repliable listant les interactions du document : action demandée, contenu avant, contenu après, tokens consommés. C'est la traçabilité exigée au cahier des charges, et elle est aussi ce qui permet à l'utilisateur de revenir sur une proposition acceptée. Elle constitue par ailleurs la base technique de la traçabilité des contenus générés demandée par l'AI Act (§ 11.4).</w:t>
+        <w:t>— section repliable listant les interactions du document : action demandée, contenu avant, contenu après, tokens consommés. C'est la traçabilité exigée au cahier des charges, et elle est aussi ce qui permet à l'utilisateur de revenir sur une proposition acceptée. Elle constitue par ailleurs la base technique de la traçabilité des contenus générés demandée par l'AI Act.</w:t>
       </w:r>
     </w:p>
     <w:p>
@@ -10181,7 +10181,7 @@
         <w:pStyle w:val="BodyText"/>
       </w:pPr>
       <w:r>
-        <w:t xml:space="preserve">Points RGAA 4.1.2 pris en compte dès la maquette : contrastes validés par construction sur la palette, zone de focus visible sur tous les éléments interactifs, ordre de tabulation suivant l'ordre de lecture, libellés explicites sur chaque champ de formulaire, et rôles ARIA sur les composants qui ne sont pas des éléments HTML natifs. L'audit outillé (Lighthouse et WAVE) et son rapport restent à produire (§ 5.1.4) ; il sera mené sur la version 4.1.2, en vigueur, la version 5 étant annoncée pour fin 2026 (§ 11.4).</w:t>
+        <w:t>Points RGAA 4.1.2 pris en compte dès la maquette : contrastes validés par construction sur la palette, zone de focus visible sur tous les éléments interactifs, ordre de tabulation suivant l'ordre de lecture, libellés explicites sur chaque champ de formulaire, et rôles ARIA sur les composants qui ne sont pas des éléments HTML natifs. L'audit outillé (Lighthouse et WAVE) et son rapport restent à produire (§ 5.1) ; il sera mené sur la version 4.1.2, en vigueur, la version 5 étant annoncée pour fin 2026 (§ 11).</w:t>
       </w:r>
     </w:p>
     <w:bookmarkEnd w:id="57"/>
@@ -10202,7 +10202,7 @@
         <w:pStyle w:val="FirstParagraph"/>
       </w:pPr>
       <w:r>
-        <w:t xml:space="preserve">Les neuf planches figurent en annexe § 12.1. Les captures des écrans réellement implémentés sont présentées en § 7.1 et § 12.2, ce qui permet de confronter la conception et la réalisation.</w:t>
+        <w:t>Les neuf planches figurent en annexe § 12.1. Les captures des écrans réellement implémentés sont présentées en § 7.1 et § 12.2, ce qui permet de confronter la conception et la réalisation.</w:t>
       </w:r>
     </w:p>
     <w:tbl>
@@ -10829,7 +10829,7 @@
         <w:pStyle w:val="FirstParagraph"/>
       </w:pPr>
       <w:r>
-        <w:t xml:space="preserve">Le modèle découle de huit règles de gestion, tirées du périmètre fonctionnel (§ 2.3) et des contraintes (§ 5.1.1) :</w:t>
+        <w:t>Le modèle découle de huit règles de gestion, tirées du périmètre fonctionnel (§ 2) et des contraintes (§ 5.1) :</w:t>
       </w:r>
     </w:p>
     <w:tbl>
@@ -11371,7 +11371,7 @@
         <w:t xml:space="preserve">/documents/42</w:t>
       </w:r>
       <w:r>
-        <w:t xml:space="preserve">) invite à l'énumération, et même si chaque accès vérifie la propriété (§ 5.2.5), un identifiant non devinable supprime la tentation. Ensuite la portabilité : l'identifiant existe avant l'insertion, ce qui simplifie la création d'objets liés en une seule transaction et rendrait une future répartition de charge indolore. Le coût est connu et accepté : un index sur 36 caractères est plus volumineux qu'un index sur un entier, pour des volumes qui restent ici sans commune mesure avec ce seuil.</w:t>
+        <w:t>) invite à l'énumération, et même si chaque accès vérifie la propriété (§ 5.2), un identifiant non devinable supprime la tentation. Ensuite la portabilité : l'identifiant existe avant l'insertion, ce qui simplifie la création d'objets liés en une seule transaction et rendrait une future répartition de charge indolore. Le coût est connu et accepté : un index sur 36 caractères est plus volumineux qu'un index sur un entier, pour des volumes qui restent ici sans commune mesure avec ce seuil.</w:t>
       </w:r>
     </w:p>
     <w:p>
@@ -11527,7 +11527,7 @@
         <w:t xml:space="preserve"> </w:t>
       </w:r>
       <w:r>
-        <w:t xml:space="preserve">du script MySQL (§ 5.5.2) apportent la garantie du SGBD sans la rigidité de l'ENUM.</w:t>
+        <w:t>du script MySQL (§ 5.5) apportent la garantie du SGBD sans la rigidité de l'ENUM.</w:t>
       </w:r>
     </w:p>
     <w:bookmarkEnd w:id="62"/>
@@ -14847,7 +14847,7 @@
         <w:t xml:space="preserve"> </w:t>
       </w:r>
       <w:r>
-        <w:t xml:space="preserve">possible : sans état serveur, un JWT reste valide jusqu'à son expiration, quoi qu'il arrive. La rotation décrite en § 4.6 s'appuie sur</w:t>
+        <w:t>possible : sans état serveur, un JWT reste valide jusqu'à son expiration, quoi qu'il arrive. La rotation décrite en § 4 s'appuie sur</w:t>
       </w:r>
       <w:r>
         <w:t xml:space="preserve"> </w:t>
@@ -16353,7 +16353,7 @@
               <w:t xml:space="preserve"> </w:t>
             </w:r>
             <w:r>
-              <w:t xml:space="preserve">ajoutées dans le script MySQL (§ 5.5.2).</w:t>
+              <w:t>ajoutées dans le script MySQL (§ 5.5).</w:t>
             </w:r>
           </w:p>
         </w:tc>
@@ -16394,7 +16394,7 @@
         <w:t xml:space="preserve"> </w:t>
       </w:r>
       <w:r>
-        <w:t xml:space="preserve">comme valeur d'exemple, alors que l'inférence est locale et qu'aucune donnée n'est transmise à OpenAI (§ 5.2.4). La valeur retenue est</w:t>
+        <w:t>comme valeur d'exemple, alors que l'inférence est locale et qu'aucune donnée n'est transmise à OpenAI (§ 5.2). La valeur retenue est</w:t>
       </w:r>
       <w:r>
         <w:t xml:space="preserve"> </w:t>
@@ -16617,7 +16617,7 @@
               <w:jc w:val="left"/>
             </w:pPr>
             <w:r>
-              <w:t xml:space="preserve">Création complète du schéma sur une base vierge (§ 5.5.2)</w:t>
+              <w:t>Création complète du schéma sur une base vierge (§ 5.5)</w:t>
             </w:r>
           </w:p>
         </w:tc>
@@ -16646,7 +16646,7 @@
               <w:jc w:val="left"/>
             </w:pPr>
             <w:r>
-              <w:t xml:space="preserve">Passage d'une base existante au schéma durci (§ 5.5.3)</w:t>
+              <w:t>Passage d'une base existante au schéma durci (§ 5.5)</w:t>
             </w:r>
           </w:p>
         </w:tc>
@@ -16679,7 +16679,7 @@
         <w:t xml:space="preserve">backend/database/schema_mysql.sql</w:t>
       </w:r>
       <w:r>
-        <w:t xml:space="preserve">) ; ses extraits significatifs figurent ci-dessous et en annexe § 12.4. Trois points de conception s'y lisent.</w:t>
+        <w:t>) ; ses extraits significatifs figurent ci-dessous et en annexe § 12.4. Trois points de conception s'y lisent.</w:t>
       </w:r>
     </w:p>
     <w:p>
@@ -19028,7 +19028,7 @@
         <w:t xml:space="preserve"> </w:t>
       </w:r>
       <w:r>
-        <w:t xml:space="preserve">selon l'intention décrite en § 5.4.5, et non</w:t>
+        <w:t>selon l'intention décrite en § 5.4, et non</w:t>
       </w:r>
       <w:r>
         <w:t xml:space="preserve"> </w:t>
@@ -19687,7 +19687,7 @@
         <w:t xml:space="preserve">ia</w:t>
       </w:r>
       <w:r>
-        <w:t xml:space="preserve">. C'est à la fois l'exigence de traçabilité du cahier des charges et le mécanisme même du quota : le comptage lit ce journal (§ 5.4.2). Journalisation et quota ne sont donc pas deux fonctionnalités séparées mais deux usages du même enregistrement.</w:t>
+        <w:t>. C'est à la fois l'exigence de traçabilité du cahier des charges et le mécanisme même du quota : le comptage lit ce journal (§ 5.4). Journalisation et quota ne sont donc pas deux fonctionnalités séparées mais deux usages du même enregistrement.</w:t>
       </w:r>
     </w:p>
     <w:p>
@@ -19797,7 +19797,7 @@
         <w:t xml:space="preserve"> </w:t>
       </w:r>
       <w:r>
-        <w:t xml:space="preserve">L'extension, elle, est conditionnelle : l'enregistrement automatique se déclenche sous condition — un titre valide et un délai d'inactivité écoulé (§ 7.1.2). L'enregistrement manuel reste le cas nominal, l'automatique l'étend.</w:t>
+        <w:t>L'extension, elle, est conditionnelle : l'enregistrement automatique se déclenche sous condition — un titre valide et un délai d'inactivité écoulé (§ 7.1). L'enregistrement manuel reste le cas nominal, l'automatique l'étend.</w:t>
       </w:r>
     </w:p>
     <w:p>
@@ -19851,7 +19851,7 @@
         <w:pStyle w:val="FirstParagraph"/>
       </w:pPr>
       <w:r>
-        <w:t xml:space="preserve">Chaque fonctionnalité listée au cahier des charges (§ 2.3) est couverte par au moins un cas d'utilisation :</w:t>
+        <w:t>Chaque fonctionnalité listée au cahier des charges (§ 2) est couverte par au moins un cas d'utilisation :</w:t>
       </w:r>
     </w:p>
     <w:tbl>
@@ -21702,7 +21702,7 @@
         <w:pStyle w:val="FirstParagraph"/>
       </w:pPr>
       <w:r>
-        <w:t xml:space="preserve">C'est l'application concrète de la règle de séparation des couches (§ 5.2.2) : le service ne connaît pas HTTP et ne renvoie pas de code de statut, il lève une exception métier. C'est la route qui décide que cette exception vaut</w:t>
+        <w:t>C'est l'application concrète de la règle de séparation des couches (§ 5.2) : le service ne connaît pas HTTP et ne renvoie pas de code de statut, il lève une exception métier. C'est la route qui décide que cette exception vaut</w:t>
       </w:r>
       <w:r>
         <w:t xml:space="preserve"> </w:t>
@@ -21781,7 +21781,7 @@
         <w:t xml:space="preserve"> </w:t>
       </w:r>
       <w:r>
-        <w:t xml:space="preserve">le retour du modèle, jamais avant. Un appel qui échoue ne laisse donc aucune trace et ne décompte pas de quota — l'utilisateur n'est pas puni d'une panne d'infrastructure. Le revers est assumé : une génération réussie dont la réponse HTTP se perdrait en route serait comptée sans être vue par l'utilisateur. Le cas JE-12 du jeu d'essai (§ 10.3) verrouille cette propriété.</w:t>
+        <w:t>le retour du modèle, jamais avant. Un appel qui échoue ne laisse donc aucune trace et ne décompte pas de quota — l'utilisateur n'est pas puni d'une panne d'infrastructure. Le revers est assumé : une génération réussie dont la réponse HTTP se perdrait en route serait comptée sans être vue par l'utilisateur. Le cas JE-12 du jeu d'essai (§ 10) verrouille cette propriété.</w:t>
       </w:r>
     </w:p>
     <w:p>
@@ -22353,7 +22353,7 @@
           <w:bCs/>
           <w:b/>
         </w:rPr>
-        <w:t>Ollama installé localement plutôt qu'un conteneur. Le modèle qwen2.5:3b pèse plusieurs gigaoctets ; le garder hors du cycle de construction du projet évite de le re-télécharger à chaque reconstruction d'image. La contrepartie est qu'il s'agit d'un composant à tenir à jour comme un autre — la version minimale 0.17.1 indiquée ci-dessus découle directement de la veille (§ 11.3).</w:t>
+        <w:t>Ollama installé localement plutôt qu'un conteneur. Le modèle qwen2.5:3b pèse plusieurs gigaoctets ; le garder hors du cycle de construction du projet évite de le re-télécharger à chaque reconstruction d'image. La contrepartie est qu'il s'agit d'un composant à tenir à jour comme un autre — la version minimale 0.17.1 indiquée ci-dessus découle directement de la veille (§ 11).</w:t>
       </w:r>
     </w:p>
     <w:bookmarkEnd w:id="82"/>
@@ -23047,7 +23047,7 @@
         <w:t xml:space="preserve"> </w:t>
       </w:r>
       <w:r>
-        <w:t xml:space="preserve">(§ 11.3), à l'installation involontaire d'une version compromise.</w:t>
+        <w:t>(§ 11), à l'installation involontaire d'une version compromise.</w:t>
       </w:r>
     </w:p>
     <w:bookmarkEnd w:id="83"/>
@@ -23263,7 +23263,7 @@
               <w:jc w:val="left"/>
             </w:pPr>
             <w:r>
-              <w:t>Styles utilitaires. daisyUI a été retiré : 45,6 Ko pour cinq classes utilisées (§ 6.7)</w:t>
+              <w:t>Styles utilitaires. daisyUI a été retiré : 45,6 Ko pour cinq classes utilisées (§ 6)</w:t>
             </w:r>
           </w:p>
         </w:tc>
@@ -23381,7 +23381,7 @@
               <w:t xml:space="preserve"> </w:t>
             </w:r>
             <w:r>
-              <w:t xml:space="preserve">avant injection (§ 7.1.2)</w:t>
+              <w:t>avant injection (§ 7.1)</w:t>
             </w:r>
           </w:p>
         </w:tc>
@@ -24837,7 +24837,7 @@
         <w:t xml:space="preserve"> </w:t>
       </w:r>
       <w:r>
-        <w:t xml:space="preserve">à la mise en production. Cette étape figure dans la liste de contrôle de déploiement (§ 6.6).</w:t>
+        <w:t>à la mise en production. Cette étape figure dans la liste de contrôle de déploiement (§ 6).</w:t>
       </w:r>
     </w:p>
     <w:bookmarkEnd w:id="86"/>
@@ -24888,7 +24888,7 @@
         <w:t xml:space="preserve"> </w:t>
       </w:r>
       <w:r>
-        <w:t xml:space="preserve">global. Ce motif permet d'instancier une application de test avec une configuration distincte, sans toucher au code de production — prérequis du plan de tests (§ 9.2).</w:t>
+        <w:t>global. Ce motif permet d'instancier une application de test avec une configuration distincte, sans toucher au code de production — prérequis du plan de tests (§ 9).</w:t>
       </w:r>
     </w:p>
     <w:p>
@@ -25268,7 +25268,7 @@
         <w:t xml:space="preserve">supports_credentials=True</w:t>
       </w:r>
       <w:r>
-        <w:t xml:space="preserve">, un joker serait d'ailleurs refusé par les navigateurs — mais l'intention est d'abord de restreindre : seule l'origine du front peut envoyer des requêtes authentifiées. L'origine est aujourd'hui codée en dur pour le développement ; elle devra passer en variable d'environnement au déploiement (§ 6.6).</w:t>
+        <w:t>, un joker serait d'ailleurs refusé par les navigateurs — mais l'intention est d'abord de restreindre : seule l'origine du front peut envoyer des requêtes authentifiées. L'origine est aujourd'hui codée en dur pour le développement ; elle devra passer en variable d'environnement au déploiement (§ 6).</w:t>
       </w:r>
     </w:p>
     <w:p>
@@ -25309,7 +25309,7 @@
         <w:pStyle w:val="FirstParagraph"/>
       </w:pPr>
       <w:r>
-        <w:t>La conteneurisation et l'intégration continue sont en place depuis le 4 octobre ; seul le déploiement proprement dit reste à faire (§ 4.2).</w:t>
+        <w:t>La conteneurisation et l'intégration continue sont en place depuis le 4 octobre ; seul le déploiement proprement dit reste à faire (§ 4).</w:t>
       </w:r>
     </w:p>
     <w:p>
@@ -25321,7 +25321,7 @@
           <w:bCs/>
           <w:b/>
         </w:rPr>
-        <w:t>Conteneurisation. Trois services dans docker-compose.yml : MySQL 8.4 avec un volume persistant et une sonde de santé, le backend (image Python, Gunicorn à la place du serveur de développement Flask, utilisateur non privilégié), et le frontend (construction Vite en deux étapes puis service des fichiers statiques par Nginx, image finale d'environ 50 Mo, repli monopage). Ollama reste hors composition, sur l'hôte, atteint par host.docker.internal : son image pèse plusieurs gigaoctets et le modèle se télécharge à part (§ 6.1). Les secrets sont déclarés sous la forme ${VAR:?message} — la composition échoue immédiatement si la variable manque, au lieu de démarrer avec une valeur inventée.</w:t>
+        <w:t>Conteneurisation. Trois services dans docker-compose.yml : MySQL 8.4 avec un volume persistant et une sonde de santé, le backend (image Python, Gunicorn à la place du serveur de développement Flask, utilisateur non privilégié), et le frontend (construction Vite en deux étapes puis service des fichiers statiques par Nginx, image finale d'environ 50 Mo, repli monopage). Ollama reste hors composition, sur l'hôte, atteint par host.docker.internal : son image pèse plusieurs gigaoctets et le modèle se télécharge à part (§ 6). Les secrets sont déclarés sous la forme ${VAR:?message} — la composition échoue immédiatement si la variable manque, au lieu de démarrer avec une valeur inventée.</w:t>
       </w:r>
     </w:p>
     <w:p>
@@ -25333,7 +25333,7 @@
           <w:bCs/>
           <w:b/>
         </w:rPr>
-        <w:t>Intégration continue. Le flux GitHub Actions (.github/workflows/ci.yml) se déclenche sur chaque push et chaque pull request, et s'organise en trois travaux parallèles : backend (Ruff en analyse et en format, puis pytest avec des clés éphémères générées pour la durée du travail), frontend (ESLint, Prettier, vérification des types par vue-tsc, Vitest, build de production), et Docker (validation de la composition puis construction des deux images). Le parallélisme n'est pas un détail de performance : avec des travaux enchaînés, un échec du frontend masquait l'état du backend, et il fallait deux exécutions pour connaître les deux. L'installation des dépendances frontend passe par npm ci --ignore-scripts : la première partie installe exactement ce que décrit package-lock.json, la seconde empêche les scripts de cycle de vie npm d'exécuter du code arbitraire — la leçon directe de l'incident axios (§ 11.3).</w:t>
+        <w:t>Intégration continue. Le flux GitHub Actions (.github/workflows/ci.yml) se déclenche sur chaque push et chaque pull request, et s'organise en trois travaux parallèles : backend (Ruff en analyse et en format, puis pytest avec des clés éphémères générées pour la durée du travail), frontend (ESLint, Prettier, vérification des types par vue-tsc, Vitest, build de production), et Docker (validation de la composition puis construction des deux images). Le parallélisme n'est pas un détail de performance : avec des travaux enchaînés, un échec du frontend masquait l'état du backend, et il fallait deux exécutions pour connaître les deux. L'installation des dépendances frontend passe par npm ci --ignore-scripts : la première partie installe exactement ce que décrit package-lock.json, la seconde empêche les scripts de cycle de vie npm d'exécuter du code arbitraire — la leçon directe de l'incident axios (§ 11).</w:t>
       </w:r>
     </w:p>
     <w:p>
@@ -25666,7 +25666,7 @@
               <w:jc w:val="left"/>
             </w:pPr>
             <w:r>
-              <w:t>Vérifier la version d'Ollama (≥ 0.18 ; 0.35.1 installée) et son écoute sur l'interface de bouclage uniquement — OLLAMA_HOST=127.0.0.1:11434 (§ 11.3)</w:t>
+              <w:t>Vérifier la version d'Ollama (≥ 0.18 ; 0.35.1 installée) et son écoute sur l'interface de bouclage uniquement — OLLAMA_HOST=127.0.0.1:11434 (§ 11)</w:t>
             </w:r>
           </w:p>
         </w:tc>
@@ -25821,7 +25821,7 @@
         <w:pStyle w:val="BodyText"/>
       </w:pPr>
       <w:r>
-        <w:t>La compression GZIP relève du serveur de fichiers statiques et est configurée dans l'image Nginx du frontend (§ 6.6). Un point reste ouvert : le paquet JavaScript dépasse 500 Ko et vite build le signale à chaque construction. Le découpage en morceaux est à envisager — CodeMirror et le back-office sont les deux candidats évidents, puisqu'un visiteur de la page d'accueil n'a besoin ni de l'un ni de l'autre.</w:t>
+        <w:t>La compression GZIP relève du serveur de fichiers statiques et est configurée dans l'image Nginx du frontend (§ 6). Un point reste ouvert : le paquet JavaScript dépasse 500 Ko et vite build le signale à chaque construction. Le découpage en morceaux est à envisager — CodeMirror et le back-office sont les deux candidats évidents, puisqu'un visiteur de la page d'accueil n'a besoin ni de l'un ni de l'autre.</w:t>
       </w:r>
     </w:p>
     <w:p>
@@ -25902,7 +25902,7 @@
         <w:pStyle w:val="FirstParagraph"/>
       </w:pPr>
       <w:r>
-        <w:t xml:space="preserve">Huit captures ont été réalisées sur l'application en fonctionnement, avec un compte de démonstration. Elles figurent intégralement en annexe § 12.2 ; cette section présente les deux écrans les plus significatifs et le code qui les produit.</w:t>
+        <w:t>Huit captures ont été réalisées sur l'application en fonctionnement, avec un compte de démonstration. Elles figurent intégralement en annexe § 12.2 ; cette section présente les deux écrans les plus significatifs et le code qui les produit.</w:t>
       </w:r>
     </w:p>
     <w:tbl>
@@ -27037,7 +27037,7 @@
         <w:t xml:space="preserve"> </w:t>
       </w:r>
       <w:r>
-        <w:t xml:space="preserve">L'exigence du cahier des charges (§ 2.3 c) est satisfaite par un enregistrement différé : la sauvegarde n'est pas déclenchée à chaque frappe, mais 2,5 secondes après la dernière.</w:t>
+        <w:t>L'exigence du cahier des charges (§ 2 c) est satisfaite par un enregistrement différé : la sauvegarde n'est pas déclenchée à chaque frappe, mais 2,5 secondes après la dernière.</w:t>
       </w:r>
     </w:p>
     <w:p>
@@ -28426,7 +28426,7 @@
           <w:iCs/>
           <w:i/>
         </w:rPr>
-        <w:t xml:space="preserve">) afin que son apparition ne décale pas le contenu. Le comportement est vérifié par le cas fonctionnel TF-06 (§ 9.5).</w:t>
+        <w:t>) afin que son apparition ne décale pas le contenu. Le comportement est vérifié par le cas fonctionnel TF-06 (§ 9).</w:t>
       </w:r>
     </w:p>
     <w:p>
@@ -31053,7 +31053,7 @@
         <w:pStyle w:val="BodyText"/>
       </w:pPr>
       <w:r>
-        <w:t xml:space="preserve">Une réserve, issue de la veille (§ 11.3) : DOMPurify est elle-même un composant à maintenir, et la version employée doit être tenue à jour. C'est l'argument qui justifie de conserver le stockage en Markdown brut comme</w:t>
+        <w:t>Une réserve, issue de la veille (§ 11) : DOMPurify est elle-même un composant à maintenir, et la version employée doit être tenue à jour. C'est l'argument qui justifie de conserver le stockage en Markdown brut comme</w:t>
       </w:r>
       <w:r>
         <w:t xml:space="preserve"> </w:t>
@@ -31066,7 +31066,7 @@
         <w:t xml:space="preserve">seconde ligne de défense</w:t>
       </w:r>
       <w:r>
-        <w:t xml:space="preserve">, indépendante de cette bibliothèque. Les cas TU-19 (§ 9.3.4) et TS-01 (§ 9.6) vérifient l'assainissement à deux niveaux : unitaire sur le calcul de l'aperçu, et fonctionnel sur un document réellement enregistré puis rechargé.</w:t>
+        <w:t>, indépendante de cette bibliothèque. Les cas TU-19 (§ 9) et TS-01 (§ 9) vérifient l'assainissement à deux niveaux : unitaire sur le calcul de l'aperçu, et fonctionnel sur un document réellement enregistré puis rechargé.</w:t>
       </w:r>
     </w:p>
     <w:p>
@@ -31201,7 +31201,7 @@
         <w:t xml:space="preserve">rapide</w:t>
       </w:r>
       <w:r>
-        <w:t xml:space="preserve">, ce qui est exactement le défaut recherché par une attaque par force brute. bcrypt est délibérément lente et son coût est paramétrable, ce qui la rend adaptée aux mots de passe. C'est l'inverse du raisonnement appliqué aux jetons (§ 7.2.2), où SHA-256 est le bon choix.</w:t>
+        <w:t>, ce qui est exactement le défaut recherché par une attaque par force brute. bcrypt est délibérément lente et son coût est paramétrable, ce qui la rend adaptée aux mots de passe. C'est l'inverse du raisonnement appliqué aux jetons (§ 7.2), où SHA-256 est le bon choix.</w:t>
       </w:r>
     </w:p>
     <w:p>
@@ -31445,7 +31445,7 @@
         <w:t xml:space="preserve">revoke = True</w:t>
       </w:r>
       <w:r>
-        <w:t xml:space="preserve">) sans purge automatique. Elle croît donc d'une ligne par rafraîchissement, soit potentiellement plusieurs centaines par utilisateur et par semaine. Une tâche de purge des lignes révoquées et expirées reste à écrire ; elle figure dans les compléments identifiés en § 8.11.</w:t>
+        <w:t>) sans purge automatique. Elle croît donc d'une ligne par rafraîchissement, soit potentiellement plusieurs centaines par utilisateur et par semaine. Une tâche de purge des lignes révoquées et expirées reste à écrire ; elle figure dans les compléments identifiés en § 8.</w:t>
       </w:r>
     </w:p>
     <w:bookmarkEnd w:id="95"/>
@@ -31533,7 +31533,7 @@
         <w:t xml:space="preserve">La consigne libre de l'utilisateur est ajoutée en fin de prompt</w:t>
       </w:r>
       <w:r>
-        <w:t xml:space="preserve">, après le gabarit. Cette position est un choix de sécurité modeste mais réel : elle ne permet pas de réécrire l'instruction initiale par simple préfixe. La protection reste faible face à une injection de prompt déterminée ; la mesure qui compte est ailleurs — aucune sortie du modèle n'est appliquée au document sans action de l'utilisateur (§ 5.6.3), et la longueur de la consigne est bornée à 500 caractères (§ 5.7.1).</w:t>
+        <w:t>, après le gabarit. Cette position est un choix de sécurité modeste mais réel : elle ne permet pas de réécrire l'instruction initiale par simple préfixe. La protection reste faible face à une injection de prompt déterminée ; la mesure qui compte est ailleurs — aucune sortie du modèle n'est appliquée au document sans action de l'utilisateur (§ 5.6), et la longueur de la consigne est bornée à 500 caractères (§ 5.7).</w:t>
       </w:r>
     </w:p>
     <w:p>
@@ -31586,7 +31586,7 @@
         <w:pStyle w:val="FirstParagraph"/>
       </w:pPr>
       <w:r>
-        <w:t xml:space="preserve">La règle annoncée en § 5.2.2 — pas de dépendance HTTP dans</w:t>
+        <w:t>La règle annoncée en § 5.2 — pas de dépendance HTTP dans</w:t>
       </w:r>
       <w:r>
         <w:t xml:space="preserve"> </w:t>
@@ -31726,7 +31726,7 @@
         <w:t xml:space="preserve"> </w:t>
       </w:r>
       <w:r>
-        <w:t xml:space="preserve">du § 9.2. La correction propre consisterait à passer ces valeurs en paramètres ou par un objet de configuration injecté ; elle est notée en § 8.11 mais n'a pas été appliquée, pour ne pas toucher à la chaîne d'authentification en fin de projet.</w:t>
+        <w:t>du § 9. La correction propre consisterait à passer ces valeurs en paramètres ou par un objet de configuration injecté ; elle est notée en § 8 mais n'a pas été appliquée, pour ne pas toucher à la chaîne d'authentification en fin de projet.</w:t>
       </w:r>
       <w:r>
         <w:t xml:space="preserve"> </w:t>
@@ -32049,7 +32049,7 @@
         <w:t xml:space="preserve"> </w:t>
       </w:r>
       <w:r>
-        <w:t xml:space="preserve">La colonne est alimentée par l'ORM à chaque modification, sans que la route ait à y penser. C'est ce qui rend le tri de la liste des documents fiable, alors que l'enregistrement automatique produit des écritures très fréquentes (§ 7.1.2).</w:t>
+        <w:t>La colonne est alimentée par l'ORM à chaque modification, sans que la route ait à y penser. C'est ce qui rend le tri de la liste des documents fiable, alors que l'enregistrement automatique produit des écritures très fréquentes (§ 7.1).</w:t>
       </w:r>
     </w:p>
     <w:p>
@@ -32104,7 +32104,7 @@
         <w:t xml:space="preserve"> </w:t>
       </w:r>
       <w:r>
-        <w:t xml:space="preserve">La première déclaration agit quand l'application supprime un objet, la seconde quand le SGBD supprime une ligne. Les deux sont nécessaires : le raisonnement RGPD complet figure en § 5.4.5.</w:t>
+        <w:t>La première déclaration agit quand l'application supprime un objet, la seconde quand le SGBD supprime une ligne. Les deux sont nécessaires : le raisonnement RGPD complet figure en § 5.4.</w:t>
       </w:r>
     </w:p>
     <w:bookmarkEnd w:id="99"/>
@@ -32155,7 +32155,7 @@
         <w:t xml:space="preserve"> </w:t>
       </w:r>
       <w:r>
-        <w:t xml:space="preserve">est traitée comme un libellé, pas comme du SQL (cas TS-02, § 9.6).</w:t>
+        <w:t>est traitée comme un libellé, pas comme du SQL (cas TS-02, § 9).</w:t>
       </w:r>
     </w:p>
     <w:p>
@@ -32546,7 +32546,7 @@
         <w:t xml:space="preserve"> </w:t>
       </w:r>
       <w:r>
-        <w:t xml:space="preserve">est expliqué en § 5.7.2.</w:t>
+        <w:t>est expliqué en § 5.7.</w:t>
       </w:r>
     </w:p>
     <w:p>
@@ -33340,7 +33340,7 @@
         <w:t xml:space="preserve"> </w:t>
       </w:r>
       <w:r>
-        <w:t xml:space="preserve">(§ 5.4.6) : le SGBD n'a ni à trier ni à parcourir la table.</w:t>
+        <w:t>(§ 5.4) : le SGBD n'a ni à trier ni à parcourir la table.</w:t>
       </w:r>
     </w:p>
     <w:bookmarkEnd w:id="101"/>
@@ -33806,7 +33806,7 @@
         <w:pStyle w:val="BodyText"/>
       </w:pPr>
       <w:r>
-        <w:t xml:space="preserve">Les statistiques globales, elles, sont de simples comptages sur fenêtre glissante, cohérents avec le mécanisme de quota (§ 5.7.2) :</w:t>
+        <w:t>Les statistiques globales, elles, sont de simples comptages sur fenêtre glissante, cohérents avec le mécanisme de quota (§ 5.7) :</w:t>
       </w:r>
     </w:p>
     <w:p>
@@ -34177,7 +34177,7 @@
         <w:t xml:space="preserve"> </w:t>
       </w:r>
       <w:r>
-        <w:t xml:space="preserve">du § 5.6.3 interdit.</w:t>
+        <w:t>du § 5.6 interdit.</w:t>
       </w:r>
     </w:p>
     <w:p>
@@ -34476,7 +34476,7 @@
         <w:pStyle w:val="BodyText"/>
       </w:pPr>
       <w:r>
-        <w:t xml:space="preserve">Le back-office ajoute une seconde couche, et c'est ici que se matérialise la décision du § 5.2.5 :</w:t>
+        <w:t>Le back-office ajoute une seconde couche, et c'est ici que se matérialise la décision du § 5.2 :</w:t>
       </w:r>
     </w:p>
     <w:p>
@@ -35229,7 +35229,7 @@
               <w:t xml:space="preserve"> </w:t>
             </w:r>
             <w:r>
-              <w:t xml:space="preserve">— il reste inaccessible même si l'assainissement de l'aperçu échouait (§ 7.1.2)</w:t>
+              <w:t>— il reste inaccessible même si l'assainissement de l'aperçu échouait (§ 7.1)</w:t>
             </w:r>
           </w:p>
         </w:tc>
@@ -35258,7 +35258,7 @@
               <w:jc w:val="left"/>
             </w:pPr>
             <w:r>
-              <w:t xml:space="preserve">Le jeton ne transite jamais sur HTTP en clair hors développement (§ 6.3)</w:t>
+              <w:t>Le jeton ne transite jamais sur HTTP en clair hors développement (§ 6)</w:t>
             </w:r>
           </w:p>
         </w:tc>
@@ -35287,7 +35287,7 @@
               <w:jc w:val="left"/>
             </w:pPr>
             <w:r>
-              <w:t>Le cookie n'est jamais envoyé sur une requête inter-site, y compris une navigation top-level que Lax laisserait passer : c'est l'atténuation CSRF principale du projet (§ 8.7)</w:t>
+              <w:t>Le cookie n'est jamais envoyé sur une requête inter-site, y compris une navigation top-level que Lax laisserait passer : c'est l'atténuation CSRF principale du projet (§ 8)</w:t>
             </w:r>
           </w:p>
         </w:tc>
@@ -35372,7 +35372,7 @@
         <w:t xml:space="preserve"> </w:t>
       </w:r>
       <w:r>
-        <w:t xml:space="preserve">est elle-même la mesure la plus utile : trois routes posent ou suppriment ce cookie, et un attribut oublié à un seul endroit suffirait à annuler la protection. Un point unique rend l'oubli impossible et rend la vérification (cas TS-08, § 9.6) simple à mener.</w:t>
+        <w:t>est elle-même la mesure la plus utile : trois routes posent ou suppriment ce cookie, et un attribut oublié à un seul endroit suffirait à annuler la protection. Un point unique rend l'oubli impossible et rend la vérification (cas TS-08, § 9) simple à mener.</w:t>
       </w:r>
     </w:p>
     <w:bookmarkEnd w:id="107"/>
@@ -35438,7 +35438,7 @@
         <w:t xml:space="preserve"> </w:t>
       </w:r>
       <w:r>
-        <w:t xml:space="preserve">(§ 6.3), et la fabrique</w:t>
+        <w:t>(§ 6), et la fabrique</w:t>
       </w:r>
       <w:r>
         <w:t xml:space="preserve"> </w:t>
@@ -35468,7 +35468,7 @@
         <w:t xml:space="preserve"> </w:t>
       </w:r>
       <w:r>
-        <w:t xml:space="preserve">(§ 6.4). Leur code complet figure en annexe § 12.5.</w:t>
+        <w:t>(§ 6). Leur code complet figure en annexe § 12.5.</w:t>
       </w:r>
     </w:p>
     <w:p>
@@ -35529,7 +35529,7 @@
         <w:t xml:space="preserve">OWASP Top 10 (2021)</w:t>
       </w:r>
       <w:r>
-        <w:t xml:space="preserve">, confrontée aux exigences du cahier des charges (§ 2.4) et aux recommandations de l'ANSSI. Le tableau ci-dessous relie chaque catégorie à sa traduction dans le projet.</w:t>
+        <w:t>, confrontée aux exigences du cahier des charges (§ 2) et aux recommandations de l'ANSSI. Le tableau ci-dessous relie chaque catégorie à sa traduction dans le projet.</w:t>
       </w:r>
     </w:p>
     <w:tbl>
@@ -35634,7 +35634,7 @@
               <w:jc w:val="left"/>
             </w:pPr>
             <w:r>
-              <w:t xml:space="preserve">§ 8.3</w:t>
+              <w:t>§ 8</w:t>
             </w:r>
           </w:p>
         </w:tc>
@@ -35672,7 +35672,7 @@
               <w:jc w:val="left"/>
             </w:pPr>
             <w:r>
-              <w:t xml:space="preserve">§ 8.2</w:t>
+              <w:t>§ 8</w:t>
             </w:r>
           </w:p>
         </w:tc>
@@ -35710,7 +35710,7 @@
               <w:jc w:val="left"/>
             </w:pPr>
             <w:r>
-              <w:t xml:space="preserve">§ 8.5, § 8.6</w:t>
+              <w:t>§ 8, § 8</w:t>
             </w:r>
           </w:p>
         </w:tc>
@@ -35748,7 +35748,7 @@
               <w:jc w:val="left"/>
             </w:pPr>
             <w:r>
-              <w:t xml:space="preserve">§ 8.4</w:t>
+              <w:t>§ 8</w:t>
             </w:r>
           </w:p>
         </w:tc>
@@ -35813,7 +35813,7 @@
               <w:jc w:val="left"/>
             </w:pPr>
             <w:r>
-              <w:t xml:space="preserve">§ 8.9</w:t>
+              <w:t>§ 8</w:t>
             </w:r>
           </w:p>
         </w:tc>
@@ -35851,7 +35851,7 @@
               <w:jc w:val="left"/>
             </w:pPr>
             <w:r>
-              <w:t xml:space="preserve">§ 11, § 9.6</w:t>
+              <w:t>§ 11, § 9</w:t>
             </w:r>
           </w:p>
         </w:tc>
@@ -35889,7 +35889,7 @@
               <w:jc w:val="left"/>
             </w:pPr>
             <w:r>
-              <w:t xml:space="preserve">§ 8.2, § 8.8</w:t>
+              <w:t>§ 8, § 8</w:t>
             </w:r>
           </w:p>
         </w:tc>
@@ -35936,7 +35936,7 @@
               <w:jc w:val="left"/>
             </w:pPr>
             <w:r>
-              <w:t xml:space="preserve">§ 5.4.5, § 5.5.2</w:t>
+              <w:t>§ 5.4, § 5.5</w:t>
             </w:r>
           </w:p>
         </w:tc>
@@ -35974,7 +35974,7 @@
               <w:jc w:val="left"/>
             </w:pPr>
             <w:r>
-              <w:t xml:space="preserve">§ 8.11</w:t>
+              <w:t>§ 8</w:t>
             </w:r>
           </w:p>
         </w:tc>
@@ -36024,7 +36024,7 @@
               <w:jc w:val="left"/>
             </w:pPr>
             <w:r>
-              <w:t xml:space="preserve">§ 8.9</w:t>
+              <w:t>§ 8</w:t>
             </w:r>
           </w:p>
         </w:tc>
@@ -36105,7 +36105,7 @@
               <w:jc w:val="left"/>
             </w:pPr>
             <w:r>
-              <w:t xml:space="preserve">bcrypt avec sel aléatoire par empreinte ; politique 8 caractères, majuscule, minuscule, chiffre, vérifiée côté serveur (§ 7.2.1)</w:t>
+              <w:t>bcrypt avec sel aléatoire par empreinte ; politique 8 caractères, majuscule, minuscule, chiffre, vérifiée côté serveur (§ 7.2)</w:t>
             </w:r>
           </w:p>
         </w:tc>
@@ -36223,7 +36223,7 @@
               <w:t xml:space="preserve">path=/auth</w:t>
             </w:r>
             <w:r>
-              <w:t xml:space="preserve">, durée 7 jours (§ 7.4.3)</w:t>
+              <w:t>, durée 7 jours (§ 7.4)</w:t>
             </w:r>
           </w:p>
         </w:tc>
@@ -36249,7 +36249,7 @@
               <w:jc w:val="left"/>
             </w:pPr>
             <w:r>
-              <w:t xml:space="preserve">Empreinte SHA-256 uniquement : une fuite de la base ne permet pas de rejouer une session (§ 7.2.2)</w:t>
+              <w:t>Empreinte SHA-256 uniquement : une fuite de la base ne permet pas de rejouer une session (§ 7.2)</w:t>
             </w:r>
           </w:p>
         </w:tc>
@@ -36487,7 +36487,7 @@
         <w:t xml:space="preserve"> </w:t>
       </w:r>
       <w:r>
-        <w:t xml:space="preserve">(§ 7.3.2). L'identifiant présent dans l'URL n'est jamais tenu pour légitime, et un identifiant appartenant à autrui produit un</w:t>
+        <w:t>(§ 7.3). L'identifiant présent dans l'URL n'est jamais tenu pour légitime, et un identifiant appartenant à autrui produit un</w:t>
       </w:r>
       <w:r>
         <w:t xml:space="preserve"> </w:t>
@@ -36502,7 +36502,7 @@
         <w:t xml:space="preserve"> </w:t>
       </w:r>
       <w:r>
-        <w:t xml:space="preserve">indiscernable d'un identifiant inexistant (§ 5.7.2). Les identifiants étant des UUID v4, ils ne sont de toute façon pas énumérables.</w:t>
+        <w:t>indiscernable d'un identifiant inexistant (§ 5.7). Les identifiants étant des UUID v4, ils ne sont de toute façon pas énumérables.</w:t>
       </w:r>
     </w:p>
     <w:p>
@@ -36535,7 +36535,7 @@
         <w:t xml:space="preserve"> </w:t>
       </w:r>
       <w:r>
-        <w:t xml:space="preserve">(§ 7.4.2). Côté client, l'entrée de menu est masquée et la garde</w:t>
+        <w:t>(§ 7.4). Côté client, l'entrée de menu est masquée et la garde</w:t>
       </w:r>
       <w:r>
         <w:t xml:space="preserve"> </w:t>
@@ -36550,7 +36550,7 @@
         <w:t xml:space="preserve"> </w:t>
       </w:r>
       <w:r>
-        <w:t xml:space="preserve">du routeur bloque l'accès direct à l'URL — mais ces deux mesures sont du confort d'usage. Le contrôle qui compte est celui du serveur, et c'est celui que vérifient les cas TS-03 et TS-04 (§ 9.6).</w:t>
+        <w:t>du routeur bloque l'accès direct à l'URL — mais ces deux mesures sont du confort d'usage. Le contrôle qui compte est celui du serveur, et c'est celui que vérifient les cas TS-03 et TS-04 (§ 9).</w:t>
       </w:r>
     </w:p>
     <w:bookmarkEnd w:id="112"/>
@@ -37402,7 +37402,7 @@
         <w:t xml:space="preserve"> </w:t>
       </w:r>
       <w:r>
-        <w:t xml:space="preserve">une requête suffirait à charger toute la table en mémoire (§ 7.3.3).</w:t>
+        <w:t>une requête suffirait à charger toute la table en mémoire (§ 7.3).</w:t>
       </w:r>
     </w:p>
     <w:bookmarkEnd w:id="113"/>
@@ -37462,7 +37462,7 @@
         <w:t xml:space="preserve">execute("SELECT</w:t>
       </w:r>
       <w:r>
-        <w:t xml:space="preserve">, ni f-string dans une requête. Le cas TS-02 (§ 9.6) le confirme par l'exécution, en soumettant</w:t>
+        <w:t>, ni f-string dans une requête. Le cas TS-02 (§ 9) le confirme par l'exécution, en soumettant</w:t>
       </w:r>
       <w:r>
         <w:t xml:space="preserve"> </w:t>
@@ -37500,7 +37500,7 @@
         <w:t xml:space="preserve"> </w:t>
       </w:r>
       <w:r>
-        <w:t xml:space="preserve">du script MySQL (§ 5.5.2) ajoutent une seconde barrière au niveau du SGBD : même une écriture directe ne peut pas insérer un</w:t>
+        <w:t>du script MySQL (§ 5.5) ajoutent une seconde barrière au niveau du SGBD : même une écriture directe ne peut pas insérer un</w:t>
       </w:r>
       <w:r>
         <w:t xml:space="preserve"> </w:t>
@@ -37564,7 +37564,7 @@
         <w:t xml:space="preserve"> </w:t>
       </w:r>
       <w:r>
-        <w:t xml:space="preserve">que présentait la première version, son mécanisme d'aggravation par l'enregistrement automatique, et sa correction par DOMPurify sont détaillés en § 7.1.2.</w:t>
+        <w:t>que présentait la première version, son mécanisme d'aggravation par l'enregistrement automatique, et sa correction par DOMPurify sont détaillés en § 7.1.</w:t>
       </w:r>
     </w:p>
     <w:p>
@@ -37742,7 +37742,7 @@
         <w:t xml:space="preserve"> </w:t>
       </w:r>
       <w:r>
-        <w:t xml:space="preserve">: même un XSS réussi ne permet pas de voler la session longue durée (§ 7.4.3).</w:t>
+        <w:t>: même un XSS réussi ne permet pas de voler la session longue durée (§ 7.4).</w:t>
       </w:r>
     </w:p>
     <w:p>
@@ -37750,7 +37750,7 @@
         <w:pStyle w:val="FirstParagraph"/>
       </w:pPr>
       <w:r>
-        <w:t xml:space="preserve">La veille a montré que la deuxième ligne est elle-même un composant à maintenir — CVE-2026-0540 affecte la version déclarée par le projet (§ 11.3). C'est précisément l'argument qui justifie de conserver les lignes 1 et 3 : une mesure de sécurité unique est un point de défaillance unique.</w:t>
+        <w:t>La veille a montré que la deuxième ligne est elle-même un composant à maintenir — CVE-2026-0540 affecte la version déclarée par le projet (§ 11). C'est précisément l'argument qui justifie de conserver les lignes 1 et 3 : une mesure de sécurité unique est un point de défaillance unique.</w:t>
       </w:r>
     </w:p>
     <w:bookmarkEnd w:id="115"/>
@@ -37845,7 +37845,7 @@
         <w:t xml:space="preserve"> </w:t>
       </w:r>
       <w:r>
-        <w:t>(§ 6.4). Un jeton CSRF dédié par double-submit a été étudié et écarté : il n'aurait rien ajouté ici, puisqu'un XSS réussi permettrait de lire le cookie et de forger l'en-tête — cette protection suppose donc le XSS de l'aperçu déjà fermé (§ 7.1.2), et les deux failles sont liées.</w:t>
+        <w:t>(§ 6). Un jeton CSRF dédié par double-submit a été étudié et écarté : il n'aurait rien ajouté ici, puisqu'un XSS réussi permettrait de lire le cookie et de forger l'en-tête — cette protection suppose donc le XSS de l'aperçu déjà fermé (§ 7.1), et les deux failles sont liées.</w:t>
       </w:r>
     </w:p>
     <w:bookmarkEnd w:id="116"/>
@@ -38170,7 +38170,7 @@
         <w:t xml:space="preserve"> </w:t>
       </w:r>
       <w:r>
-        <w:t xml:space="preserve">est normalisée en JSON et volontairement peu bavarde, sans indiquer le nombre de tentatives restantes ni la durée du blocage (§ 6.4).</w:t>
+        <w:t>est normalisée en JSON et volontairement peu bavarde, sans indiquer le nombre de tentatives restantes ni la durée du blocage (§ 6).</w:t>
       </w:r>
     </w:p>
     <w:p>
@@ -38354,7 +38354,7 @@
         <w:t xml:space="preserve"> </w:t>
       </w:r>
       <w:r>
-        <w:t xml:space="preserve">avec le message « Email ou mot de passe incorrect ». Cette cohérence connaît une exception, documentée en § 8.11.</w:t>
+        <w:t>avec le message « Email ou mot de passe incorrect ». Cette cohérence connaît une exception, documentée en § 8.</w:t>
       </w:r>
     </w:p>
     <w:bookmarkEnd w:id="117"/>
@@ -38474,7 +38474,7 @@
               <w:t xml:space="preserve"> </w:t>
             </w:r>
             <w:r>
-              <w:t xml:space="preserve">documenté (§ 6.3)</w:t>
+              <w:t>documenté (§ 6)</w:t>
             </w:r>
           </w:p>
         </w:tc>
@@ -38644,7 +38644,7 @@
               <w:t xml:space="preserve">.env</w:t>
             </w:r>
             <w:r>
-              <w:t xml:space="preserve">, ni base de développement, ni clé — vérifié par le cas TS-06 (§ 9.6)</w:t>
+              <w:t>, ni base de développement, ni clé — vérifié par le cas TS-06 (§ 9)</w:t>
             </w:r>
           </w:p>
         </w:tc>
@@ -38708,7 +38708,7 @@
               <w:jc w:val="left"/>
             </w:pPr>
             <w:r>
-              <w:t>Écoute sur l'interface de bouclage uniquement, version ≥ 0.18 (§ 11.3)</w:t>
+              <w:t>Écoute sur l'interface de bouclage uniquement, version ≥ 0.18 (§ 11)</w:t>
             </w:r>
           </w:p>
         </w:tc>
@@ -38719,7 +38719,7 @@
         <w:pStyle w:val="BodyText"/>
       </w:pPr>
       <w:r>
-        <w:t xml:space="preserve">Le dernier point de ce tableau est la seule mesure de ce dossier qui ne soit pas dans le code : c'est une consigne de déploiement. Elle figure donc dans la liste de contrôle du § 6.6, parce qu'une mesure de sécurité qui n'est écrite nulle part n'est pas une mesure.</w:t>
+        <w:t>Le dernier point de ce tableau est la seule mesure de ce dossier qui ne soit pas dans le code : c'est une consigne de déploiement. Elle figure donc dans la liste de contrôle du § 6, parce qu'une mesure de sécurité qui n'est écrite nulle part n'est pas une mesure.</w:t>
       </w:r>
     </w:p>
     <w:bookmarkEnd w:id="118"/>
@@ -38838,7 +38838,7 @@
               <w:t xml:space="preserve"> </w:t>
             </w:r>
             <w:r>
-              <w:t xml:space="preserve">: type, réponse et horodatage de chaque recueil (§ 5.4.4) ; l'inscription est refusée sans consentement explicite</w:t>
+              <w:t>: type, réponse et horodatage de chaque recueil (§ 5.4) ; l'inscription est refusée sans consentement explicite</w:t>
             </w:r>
           </w:p>
         </w:tc>
@@ -38880,7 +38880,7 @@
               <w:t xml:space="preserve"> </w:t>
             </w:r>
             <w:r>
-              <w:t xml:space="preserve">côté SGBD (§ 5.4.5)</w:t>
+              <w:t>côté SGBD (§ 5.4)</w:t>
             </w:r>
           </w:p>
         </w:tc>
@@ -38906,7 +38906,7 @@
               <w:jc w:val="left"/>
             </w:pPr>
             <w:r>
-              <w:t xml:space="preserve">Inférence entièrement locale : aucun contenu rédigé ne quitte l'infrastructure (§ 5.2.4)</w:t>
+              <w:t>Inférence entièrement locale : aucun contenu rédigé ne quitte l'infrastructure (§ 5.2)</w:t>
             </w:r>
           </w:p>
         </w:tc>
@@ -38958,7 +38958,7 @@
               <w:jc w:val="left"/>
             </w:pPr>
             <w:r>
-              <w:t xml:space="preserve">Partiellement couverte ; compléments AI Act identifiés en § 11.4</w:t>
+              <w:t>Partiellement couverte ; compléments AI Act identifiés</w:t>
             </w:r>
           </w:p>
         </w:tc>
@@ -39032,7 +39032,7 @@
         <w:t xml:space="preserve">content_after</w:t>
       </w:r>
       <w:r>
-        <w:t xml:space="preserve">, c'est-à-dire des extraits des documents de l'utilisateur. Cette conservation est nécessaire à la traçabilité exigée par le cahier des charges et à l'obligation de marquage de l'AI Act, mais elle double le stockage des contenus. Une durée de conservation explicite, et sa mention dans la politique de confidentialité, restent à définir (§ 8.11).</w:t>
+        <w:t>, c'est-à-dire des extraits des documents de l'utilisateur. Cette conservation est nécessaire à la traçabilité exigée par le cahier des charges et à l'obligation de marquage de l'AI Act, mais elle double le stockage des contenus. Une durée de conservation explicite, et sa mention dans la politique de confidentialité, restent à définir (§ 8).</w:t>
       </w:r>
     </w:p>
     <w:bookmarkEnd w:id="119"/>
@@ -39220,7 +39220,7 @@
               <w:jc w:val="left"/>
             </w:pPr>
             <w:r>
-              <w:t>Risque accepté et argumenté (KAN-94, § 4.1 du rapport d'audit) : l'inscription est la seule route où l'anti-énumération coûterait l'information « cette adresse est déjà prise »</w:t>
+              <w:t>Risque accepté et argumenté (KAN-94, § 4 du rapport d'audit) : l'inscription est la seule route où l'anti-énumération coûterait l'information « cette adresse est déjà prise »</w:t>
             </w:r>
           </w:p>
         </w:tc>
@@ -39394,19 +39394,19 @@
               <w:jc w:val="left"/>
             </w:pPr>
             <w:r>
-              <w:t xml:space="preserve">La règle de découpage du § 5.2.2 n'est pas strictement tenue</w:t>
-            </w:r>
-          </w:p>
-        </w:tc>
-        <w:tc>
-          <w:tcPr/>
-          <w:p>
-            <w:pPr>
-              <w:pStyle w:val="Compact"/>
-              <w:jc w:val="left"/>
-            </w:pPr>
-            <w:r>
-              <w:t xml:space="preserve">Injecter la configuration en paramètre (§ 7.2.4)</w:t>
+              <w:t>La règle de découpage du § 5.2 n'est pas strictement tenue</w:t>
+            </w:r>
+          </w:p>
+        </w:tc>
+        <w:tc>
+          <w:tcPr/>
+          <w:p>
+            <w:pPr>
+              <w:pStyle w:val="Compact"/>
+              <w:jc w:val="left"/>
+            </w:pPr>
+            <w:r>
+              <w:t>Injecter la configuration en paramètre (§ 7.2)</w:t>
             </w:r>
           </w:p>
         </w:tc>
@@ -39687,7 +39687,7 @@
           <w:bCs/>
           <w:b/>
         </w:rPr>
-        <w:t>Le premier écart est le plus instructif, et il n'a pas été corrigé mais assumé. Le projet applique l'anti-énumération à /login et /forgot-password, et la contredit à /register, qui répond 409 « Cet email est déjà utilisé ». La route a été écrite avant les deux autres, à un moment où le message explicite paraissait un simple confort d'usage : c'est le schéma habituel d'un défaut de sécurité — non pas une mesure ignorée, mais une mesure appliquée de façon inégale. La fermer demanderait de répondre 201 dans les deux cas et d'informer par courriel l'adresse déjà inscrite, au prix d'un parcours d'inscription qui ne dit plus à l'utilisateur légitime pourquoi son compte n'est pas créé. L'arbitrage est documenté au § 4.1 du rapport d'audit (KAN-94) : le risque est accepté, parce que l'information divulguée — « cette adresse a un compte » — est de faible valeur sur un service sans dimension sensible, et que le coût d'usage est immédiat. J'en retiens surtout qu'une propriété de sécurité doit être vérifiée sur toutes les routes concernées, pas sur celle qu'on écrit au moment où on y pense : c'est la raison d'être des tests TS-03 et TS-04 (§ 9.6), qui balaient l'ensemble des routes plutôt qu'un cas représentatif.</w:t>
+        <w:t>Le premier écart est le plus instructif, et il n'a pas été corrigé mais assumé. Le projet applique l'anti-énumération à /login et /forgot-password, et la contredit à /register, qui répond 409 « Cet email est déjà utilisé ». La route a été écrite avant les deux autres, à un moment où le message explicite paraissait un simple confort d'usage : c'est le schéma habituel d'un défaut de sécurité — non pas une mesure ignorée, mais une mesure appliquée de façon inégale. La fermer demanderait de répondre 201 dans les deux cas et d'informer par courriel l'adresse déjà inscrite, au prix d'un parcours d'inscription qui ne dit plus à l'utilisateur légitime pourquoi son compte n'est pas créé. L'arbitrage est documenté au § 4 du rapport d'audit (KAN-94) : le risque est accepté, parce que l'information divulguée — « cette adresse a un compte » — est de faible valeur sur un service sans dimension sensible, et que le coût d'usage est immédiat. J'en retiens surtout qu'une propriété de sécurité doit être vérifiée sur toutes les routes concernées, pas sur celle qu'on écrit au moment où on y pense : c'est la raison d'être des tests TS-03 et TS-04 (§ 9), qui balaient l'ensemble des routes plutôt qu'un cas représentatif.</w:t>
       </w:r>
     </w:p>
     <w:p>
@@ -40099,7 +40099,7 @@
         <w:pStyle w:val="BodyText"/>
       </w:pPr>
       <w:r>
-        <w:t xml:space="preserve">La base de cette pyramide est la règle d'architecture du § 5.2.2 :</w:t>
+        <w:t>La base de cette pyramide est la règle d'architecture du § 5.2 :</w:t>
       </w:r>
       <w:r>
         <w:t xml:space="preserve"> </w:t>
@@ -40243,7 +40243,7 @@
         <w:t xml:space="preserve"> </w:t>
       </w:r>
       <w:r>
-        <w:t xml:space="preserve">(§ 6.4) permet d'instancier une application dédiée aux tests, avec une configuration distincte de celle de production.</w:t>
+        <w:t>(§ 6) permet d'instancier une application dédiée aux tests, avec une configuration distincte de celle de production.</w:t>
       </w:r>
     </w:p>
     <w:p>
@@ -41021,7 +41021,7 @@
         <w:t xml:space="preserve"> </w:t>
       </w:r>
       <w:r>
-        <w:t xml:space="preserve">Flask-Limiter protège les routes d'authentification (§ 6.4) ; laissé actif, il ferait échouer par</w:t>
+        <w:t>Flask-Limiter protège les routes d'authentification (§ 6) ; laissé actif, il ferait échouer par</w:t>
       </w:r>
       <w:r>
         <w:t xml:space="preserve"> </w:t>
@@ -41129,7 +41129,7 @@
         <w:t xml:space="preserve"> </w:t>
       </w:r>
       <w:r>
-        <w:t xml:space="preserve">est pure : mêmes entrées, même sortie, aucun effet de bord. C'est le cas le plus simple à couvrir et l'un des plus utiles, puisque le prompt détermine réellement le comportement du modèle (§ 4.6).</w:t>
+        <w:t>est pure : mêmes entrées, même sortie, aucun effet de bord. C'est le cas le plus simple à couvrir et l'un des plus utiles, puisque le prompt détermine réellement le comportement du modèle (§ 4).</w:t>
       </w:r>
     </w:p>
     <w:tbl>
@@ -41357,7 +41357,7 @@
               <w:jc w:val="left"/>
             </w:pPr>
             <w:r>
-              <w:t xml:space="preserve">Aucun ne mentionne « juridique » (non-régression du § 4.6)</w:t>
+              <w:t>Aucun ne mentionne « juridique » (non-régression du § 4)</w:t>
             </w:r>
           </w:p>
         </w:tc>
@@ -41692,7 +41692,7 @@
         <w:rPr>
           <w:rStyle w:val="CommentTok"/>
         </w:rPr>
-        <w:t xml:space="preserve"># Non-régression : le positionnement a dérivé une fois (§ 4.6).</w:t>
+        <w:t># Non-régression : le positionnement a dérivé une fois (§ 4).</w:t>
       </w:r>
       <w:r>
         <w:br/>
@@ -41772,7 +41772,7 @@
         <w:pStyle w:val="FirstParagraph"/>
       </w:pPr>
       <w:r>
-        <w:t xml:space="preserve">Le cas TU-04 est le plus instructif, parce qu'il est né d'une erreur réelle. La dérive du positionnement éditorial décrite en § 4.6 n'avait été rattrapée que par une relecture ; elle est désormais couverte par un test. Un prompt est du code, il se teste comme du code.</w:t>
+        <w:t>Le cas TU-04 est le plus instructif, parce qu'il est né d'une erreur réelle. La dérive du positionnement éditorial décrite en § 4 n'avait été rattrapée que par une relecture ; elle est désormais couverte par un test. Un prompt est du code, il se teste comme du code.</w:t>
       </w:r>
     </w:p>
     <w:bookmarkEnd w:id="123"/>
@@ -41832,7 +41832,7 @@
         <w:t xml:space="preserve"> </w:t>
       </w:r>
       <w:r>
-        <w:t xml:space="preserve">porteuse d'un message lisible (§ 5.7.3).</w:t>
+        <w:t>porteuse d'un message lisible (§ 5.7).</w:t>
       </w:r>
     </w:p>
     <w:tbl>
@@ -41978,7 +41978,7 @@
               <w:rPr>
                 <w:rStyle w:val="VerbatimChar"/>
               </w:rPr>
-              <w:t>RuntimeError « La connexion à Ollama … n'a pas abouti » — filet de sécurité, plus aucun délai n'est imposé à la lecture (§ 6.1)</w:t>
+              <w:t>RuntimeError « La connexion à Ollama … n'a pas abouti » — filet de sécurité, plus aucun délai n'est imposé à la lecture (§ 6)</w:t>
             </w:r>
           </w:p>
         </w:tc>
@@ -42445,7 +42445,7 @@
         <w:t xml:space="preserve"> </w:t>
       </w:r>
       <w:r>
-        <w:t xml:space="preserve">relevée dans la veille (CVE-2026-48526, § 11.2). Le projet n'est pas affecté par cette CVE, mais la propriété qu'elle exploite — un vérificateur qui accepte l'algorithme annoncé par le jeton lui-même — mérite un test permanent plutôt qu'une vérification ponctuelle.</w:t>
+        <w:t>relevée dans la veille (CVE-2026-48526, § 11). Le projet n'est pas affecté par cette CVE, mais la propriété qu'elle exploite — un vérificateur qui accepte l'algorithme annoncé par le jeton lui-même — mérite un test permanent plutôt qu'une vérification ponctuelle.</w:t>
       </w:r>
     </w:p>
     <w:bookmarkEnd w:id="125"/>
@@ -42490,7 +42490,7 @@
         <w:t xml:space="preserve"> </w:t>
       </w:r>
       <w:r>
-        <w:t xml:space="preserve">(§ 7.1.2) :</w:t>
+        <w:t>(§ 7.1) :</w:t>
       </w:r>
     </w:p>
     <w:tbl>
@@ -42791,7 +42791,7 @@
         <w:t xml:space="preserve">POST /documents/&lt;id&gt;/ia/generer</w:t>
       </w:r>
       <w:r>
-        <w:t xml:space="preserve">, la route la plus riche en contrôles (§ 5.7.2), puis déclinés sur les autres.</w:t>
+        <w:t>, la route la plus riche en contrôles (§ 5.7), puis déclinés sur les autres.</w:t>
       </w:r>
     </w:p>
     <w:tbl>
@@ -43548,7 +43548,7 @@
         <w:t xml:space="preserve"> </w:t>
       </w:r>
       <w:r>
-        <w:t xml:space="preserve">C'est la mesure anti-énumération du § 5.7.2. Le test compare non seulement les deux codes de statut mais les deux corps de réponse : une différence de message rétablirait la fuite d'information que le</w:t>
+        <w:t>C'est la mesure anti-énumération du § 5.7. Le test compare non seulement les deux codes de statut mais les deux corps de réponse : une différence de message rétablirait la fuite d'information que le</w:t>
       </w:r>
       <w:r>
         <w:t xml:space="preserve"> </w:t>
@@ -43862,7 +43862,7 @@
         <w:t xml:space="preserve"> </w:t>
       </w:r>
       <w:r>
-        <w:t xml:space="preserve">Le test insère 19 appels datés de moins de 24 heures et un appel daté de 25 heures, puis demande une génération : elle doit réussir. Un compteur remis à zéro à minuit passerait TI-10 mais échouerait TI-11. C'est donc bien le mécanisme du § 5.7.2 qui est vérifié, et non son résultat apparent.</w:t>
+        <w:t>Le test insère 19 appels datés de moins de 24 heures et un appel daté de 25 heures, puis demande une génération : elle doit réussir. Un compteur remis à zéro à minuit passerait TI-10 mais échouerait TI-11. C'est donc bien le mécanisme du § 5.7 qui est vérifié, et non son résultat apparent.</w:t>
       </w:r>
     </w:p>
     <w:p>
@@ -44072,7 +44072,7 @@
               <w:t xml:space="preserve"> </w:t>
             </w:r>
             <w:r>
-              <w:t xml:space="preserve">les sessions révoquées (§ 4.6)</w:t>
+              <w:t>les sessions révoquées (§ 4)</w:t>
             </w:r>
           </w:p>
         </w:tc>
@@ -44239,7 +44239,7 @@
               <w:t xml:space="preserve"> </w:t>
             </w:r>
             <w:r>
-              <w:t xml:space="preserve">; rôle rétrogradé en base sans nouveau jeton → accès refusé immédiatement (§ 5.2.5)</w:t>
+              <w:t>; rôle rétrogradé en base sans nouveau jeton → accès refusé immédiatement (§ 5.2)</w:t>
             </w:r>
           </w:p>
         </w:tc>
@@ -44250,7 +44250,7 @@
         <w:pStyle w:val="BodyText"/>
       </w:pPr>
       <w:r>
-        <w:t xml:space="preserve">Le dernier cas mérite d'être souligné : il vérifie une décision explicite du § 5.2.5, celle de relire le rôle en base à chaque appel plutôt que de le lire dans le JWT. Un test qui se contenterait de vérifier qu'un compte</w:t>
+        <w:t>Le dernier cas mérite d'être souligné : il vérifie une décision explicite du § 5.2, celle de relire le rôle en base à chaque appel plutôt que de le lire dans le JWT. Un test qui se contenterait de vérifier qu'un compte</w:t>
       </w:r>
       <w:r>
         <w:t xml:space="preserve"> </w:t>
@@ -44832,7 +44832,7 @@
               <w:jc w:val="left"/>
             </w:pPr>
             <w:r>
-              <w:t xml:space="preserve">Les documents survivent et réapparaissent hors dossier (§ 5.4.5)</w:t>
+              <w:t>Les documents survivent et réapparaissent hors dossier (§ 5.4)</w:t>
             </w:r>
           </w:p>
         </w:tc>
@@ -45514,7 +45514,7 @@
               <w:jc w:val="left"/>
             </w:pPr>
             <w:r>
-              <w:t xml:space="preserve">L'application refuse de démarrer (§ 6.3)</w:t>
+              <w:t>L'application refuse de démarrer (§ 6)</w:t>
             </w:r>
           </w:p>
         </w:tc>
@@ -45702,7 +45702,7 @@
         <w:pStyle w:val="BodyText"/>
       </w:pPr>
       <w:r>
-        <w:t>TS-09 est le seul test de cette liste qui puisse échouer sans qu'aucune ligne de code ait changé : une vulnérabilité publiée hier rend rouge un code inchangé. Sa place est donc dans le pipeline d'intégration continue (§ 6.6) et non dans une campagne ponctuelle — c'est ce qui relie ce plan de tests au journal de veille du § 11. Il y est aujourd'hui exécuté à la main : l'étape automatisée reste à ajouter, et c'est le dernier point ouvert du pipeline.</w:t>
+        <w:t>TS-09 est le seul test de cette liste qui puisse échouer sans qu'aucune ligne de code ait changé : une vulnérabilité publiée hier rend rouge un code inchangé. Sa place est donc dans le pipeline d'intégration continue (§ 6) et non dans une campagne ponctuelle — c'est ce qui relie ce plan de tests au journal de veille du § 11. Il y est aujourd'hui exécuté à la main : l'étape automatisée reste à ajouter, et c'est le dernier point ouvert du pipeline.</w:t>
       </w:r>
     </w:p>
     <w:p>
@@ -45731,7 +45731,7 @@
         <w:pStyle w:val="FirstParagraph"/>
       </w:pPr>
       <w:r>
-        <w:t>L'audit a été mené le 3 octobre 2026 (docs/audit-accessibilite.md) : axe-core sur l'application démarrée, les dix écrans publics puis les cinq écrans authentifiés, ceux-ci dans un conteneur jetable avec un compte de test et une connexion par l'interface. Référentiel RGAA 4.1.2 (§ 11.4).</w:t>
+        <w:t>L'audit a été mené le 3 octobre 2026 (docs/audit-accessibilite.md) : axe-core sur l'application démarrée, les dix écrans publics puis les cinq écrans authentifiés, ceux-ci dans un conteneur jetable avec un compte de test et une connexion par l'interface. Référentiel RGAA 4.1.2 (§ 11).</w:t>
       </w:r>
     </w:p>
     <w:p>
@@ -45739,7 +45739,7 @@
         <w:pStyle w:val="FirstParagraph"/>
       </w:pPr>
       <w:r>
-        <w:t>Le résultat tient en un chiffre et une nuance. Le chiffre : 120 occurrences sur trois règles, dont 117 dues à une seule couleur — l'accent #E0533C de la charte (§ 5.3.2) ne tenait pas le rapport de contraste de 4,5:1 sur le fond clair. L'assombrir en #C4341C a corrigé 64 violations mesurées sur les dix écrans publics, pour une modification de 199 occurrences dans 19 fichiers. Les teintes de survol ont suivi (#A72C18), sans quoi le survol serait devenu plus clair que l'état normal. Deux constats restaient ensuite : l'étiquette du champ de quota du back-office, seul constat de niveau critique — la page affiche autant de champs que de lignes, un aria-label citant l'utilisateur concerné était donc nécessaire — et la zone CodeMirror, qu'aucune balise &lt;label&gt; ne peut désigner puisqu'il s'agit d'un contenteditable, traitée par EditorView.contentAttributes. Bilan après correction : 15 écrans, 0 violation axe-core, WCAG 2.0 et 2.1, niveaux A et AA.</w:t>
+        <w:t>Le résultat tient en un chiffre et une nuance. Le chiffre : 120 occurrences sur trois règles, dont 117 dues à une seule couleur — l'accent #E0533C de la charte (§ 5.3) ne tenait pas le rapport de contraste de 4,5:1 sur le fond clair. L'assombrir en #C4341C a corrigé 64 violations mesurées sur les dix écrans publics, pour une modification de 199 occurrences dans 19 fichiers. Les teintes de survol ont suivi (#A72C18), sans quoi le survol serait devenu plus clair que l'état normal. Deux constats restaient ensuite : l'étiquette du champ de quota du back-office, seul constat de niveau critique — la page affiche autant de champs que de lignes, un aria-label citant l'utilisateur concerné était donc nécessaire — et la zone CodeMirror, qu'aucune balise &lt;label&gt; ne peut désigner puisqu'il s'agit d'un contenteditable, traitée par EditorView.contentAttributes. Bilan après correction : 15 écrans, 0 violation axe-core, WCAG 2.0 et 2.1, niveaux A et AA.</w:t>
       </w:r>
     </w:p>
     <w:p>
@@ -45784,7 +45784,7 @@
         <w:pStyle w:val="BodyText"/>
       </w:pPr>
       <w:r>
-        <w:t>L'objectif de couverture est de 80 % sur la couche services/ et sur les routes, sans objectif chiffré ailleurs. Viser un pourcentage global pousse à écrire des tests faciles sur du code sans risque ; cibler les couches sensibles est plus utile. Le pipeline GitHub Actions (§ 6.6) enchaîne Ruff, ESLint, Prettier, vue-tsc, pytest, Vitest et la construction des images à chaque push et chaque pull request ; pip-audit et npm audit restent à y brancher.</w:t>
+        <w:t>L'objectif de couverture est de 80 % sur la couche services/ et sur les routes, sans objectif chiffré ailleurs. Viser un pourcentage global pousse à écrire des tests faciles sur du code sans risque ; cibler les couches sensibles est plus utile. Le pipeline GitHub Actions (§ 6) enchaîne Ruff, ESLint, Prettier, vue-tsc, pytest, Vitest et la construction des images à chaque push et chaque pull request ; pip-audit et npm audit restent à y brancher.</w:t>
       </w:r>
     </w:p>
     <w:p>
@@ -45812,7 +45812,7 @@
         <w:pStyle w:val="BodyText"/>
       </w:pPr>
       <w:r>
-        <w:t>Une leçon de méthode, et c'est celle que je retiens de la campagne : les doubles de test mentent. Trois défauts de la chaîne IA sont passés sous un faux requests.post qui acceptait json() à tout moment et ne libérait jamais de connexion — dont précisément celui qui rendait illisible le diagnostic d'Ollama une fois la connexion fermée (§ 7.2.3). Il a fallu un vrai serveur HTTP, un http.server qui imite /api/generate, pour les voir. Les tests ajoutés ensuite ont été vérifiés par mutation : on casse volontairement le code pour s'assurer qu'ils échouent. Un test qu'on n'a jamais vu échouer ne prouve rien.</w:t>
+        <w:t>Une leçon de méthode, et c'est celle que je retiens de la campagne : les doubles de test mentent. Trois défauts de la chaîne IA sont passés sous un faux requests.post qui acceptait json() à tout moment et ne libérait jamais de connexion — dont précisément celui qui rendait illisible le diagnostic d'Ollama une fois la connexion fermée (§ 7.2). Il a fallu un vrai serveur HTTP, un http.server qui imite /api/generate, pour les voir. Les tests ajoutés ensuite ont été vérifiés par mutation : on casse volontairement le code pour s'assurer qu'ils échouent. Un test qu'on n'a jamais vu échouer ne prouve rien.</w:t>
       </w:r>
     </w:p>
     <w:p>
@@ -45871,7 +45871,7 @@
         <w:t xml:space="preserve">POST /documents/&lt;id&gt;/ia/generer</w:t>
       </w:r>
       <w:r>
-        <w:t xml:space="preserve">. C'est la fonctionnalité la plus significative du projet à trois titres : elle traverse les trois couches du backend et sollicite un système externe (§ 5.2.1) ; elle concentre cinq contrôles de nature différente — authentification, validation, autorisation, quota, disponibilité (§ 5.7.2) ; et elle porte les deux exigences les plus délicates du cahier des charges, le quota de 20 appels par 24 heures et la traçabilité des interactions.</w:t>
+        <w:t>. C'est la fonctionnalité la plus significative du projet à trois titres : elle traverse les trois couches du backend et sollicite un système externe (§ 5.2) ; elle concentre cinq contrôles de nature différente — authentification, validation, autorisation, quota, disponibilité (§ 5.7) ; et elle porte les deux exigences les plus délicates du cahier des charges, le quota de 20 appels par 24 heures et la traçabilité des interactions.</w:t>
       </w:r>
     </w:p>
     <w:p>
@@ -45879,7 +45879,7 @@
         <w:pStyle w:val="BodyText"/>
       </w:pPr>
       <w:r>
-        <w:t xml:space="preserve">C'est aussi la fonctionnalité qu'aucune capture d'écran ne peut attester, puisqu'elle se manifeste par un enchaînement et non par un état (§ 4.6, § 12.2). D'où la nécessité d'un jeu d'essai documenté.</w:t>
+        <w:t>C'est aussi la fonctionnalité qu'aucune capture d'écran ne peut attester, puisqu'elle se manifeste par un enchaînement et non par un état (§ 4, § 12.2). D'où la nécessité d'un jeu d'essai documenté.</w:t>
       </w:r>
     </w:p>
     <w:bookmarkEnd w:id="133"/>
@@ -48187,7 +48187,7 @@
         <w:t xml:space="preserve">inchangée</w:t>
       </w:r>
       <w:r>
-        <w:t xml:space="preserve">. C'est la traduction du § 5.6.3, où « insérer ou remplacer » est un cas d'utilisation distinct de la génération. Un jeu d'essai qui se contenterait de vérifier la présence de</w:t>
+        <w:t>. C'est la traduction du § 5.6, où « insérer ou remplacer » est un cas d'utilisation distinct de la génération. Un jeu d'essai qui se contenterait de vérifier la présence de</w:t>
       </w:r>
       <w:r>
         <w:t xml:space="preserve"> </w:t>
@@ -48415,7 +48415,7 @@
         <w:t xml:space="preserve"> </w:t>
       </w:r>
       <w:r>
-        <w:t xml:space="preserve">(§ 5.7.3). Trois lignes déplacées suffiraient à la casser, sans qu'aucune erreur ne se manifeste : l'utilisateur perdrait simplement du quota à chaque panne, ce qui ne se remarquerait qu'à l'usage, et se diagnostiquerait mal. C'est exactement le genre de régression silencieuse qu'un jeu d'essai documenté sert à empêcher.</w:t>
+        <w:t>(§ 5.7). Trois lignes déplacées suffiraient à la casser, sans qu'aucune erreur ne se manifeste : l'utilisateur perdrait simplement du quota à chaque panne, ce qui ne se remarquerait qu'à l'usage, et se diagnostiquerait mal. C'est exactement le genre de régression silencieuse qu'un jeu d'essai documenté sert à empêcher.</w:t>
       </w:r>
     </w:p>
     <w:bookmarkEnd w:id="136"/>
@@ -49920,7 +49920,7 @@
         <w:t xml:space="preserve"> </w:t>
       </w:r>
       <w:r>
-        <w:t xml:space="preserve">comme un contrôle de routine intégré à l'intégration continue (§ 6.6, cas TS-09 du § 9.6).</w:t>
+        <w:t>comme un contrôle de routine intégré à l'intégration continue (§ 6, cas TS-09 du § 9).</w:t>
       </w:r>
     </w:p>
     <w:bookmarkEnd w:id="141"/>
@@ -50005,7 +50005,7 @@
           <w:bCs/>
           <w:b/>
         </w:rPr>
-        <w:t>Le projet était partiellement protégé par sa configuration : Ollama n'écoutait que sur localhost, donc n'était pas exposé au réseau. La mise à jour a été appliquée — 0.35.1 installée, très au-delà du seuil de 0.18 fixé au § 4.2 du rapport d'audit — et la règle d'écoute sur la seule interface de bouclage est passée du statut d'habitude implicite à celui de consigne écrite (§ 5.2.1, § 6.6). Son application explicite par OLLAMA_HOST=127.0.0.1:11434 reste à poser sur le poste : aujourd'hui le comportement par défaut suffit, mais une mesure qui dépend d'un défaut n'est pas une mesure.</w:t>
+        <w:t>Le projet était partiellement protégé par sa configuration : Ollama n'écoutait que sur localhost, donc n'était pas exposé au réseau. La mise à jour a été appliquée — 0.35.1 installée, très au-delà du seuil de 0.18 fixé au § 4 du rapport d'audit — et la règle d'écoute sur la seule interface de bouclage est passée du statut d'habitude implicite à celui de consigne écrite (§ 5.2, § 6). Son application explicite par OLLAMA_HOST=127.0.0.1:11434 reste à poser sur le poste : aujourd'hui le comportement par défaut suffit, mais une mesure qui dépend d'un défaut n'est pas une mesure.</w:t>
       </w:r>
     </w:p>
     <w:p>
@@ -50013,7 +50013,7 @@
         <w:pStyle w:val="BodyText"/>
       </w:pPr>
       <w:r>
-        <w:t xml:space="preserve">Cette entrée éclaire rétrospectivement le choix d'architecture du § 5.2.4. L'arbitrage entre l'API OpenAI et un modèle local avait été tranché sur le terrain du RGPD : l'inférence locale garantit qu'aucun contenu utilisateur ne quitte l'infrastructure. La veille montre que cet arbitrage a une</w:t>
+        <w:t>Cette entrée éclaire rétrospectivement le choix d'architecture du § 5.2. L'arbitrage entre l'API OpenAI et un modèle local avait été tranché sur le terrain du RGPD : l'inférence locale garantit qu'aucun contenu utilisateur ne quitte l'infrastructure. La veille montre que cet arbitrage a une</w:t>
       </w:r>
       <w:r>
         <w:t xml:space="preserve"> </w:t>
@@ -50137,7 +50137,7 @@
         <w:t xml:space="preserve"> </w:t>
       </w:r>
       <w:r>
-        <w:t xml:space="preserve">la faille XSS de l'aperçu Markdown (§ 7.1.2). Découvrir qu'elle porte elle-même une vulnérabilité de contournement établit un principe que je n'avais pas formulé avant :</w:t>
+        <w:t>la faille XSS de l'aperçu Markdown (§ 7.1). Découvrir qu'elle porte elle-même une vulnérabilité de contournement établit un principe que je n'avais pas formulé avant :</w:t>
       </w:r>
       <w:r>
         <w:t xml:space="preserve"> </w:t>
@@ -50174,7 +50174,7 @@
         <w:t xml:space="preserve"> </w:t>
       </w:r>
       <w:r>
-        <w:t xml:space="preserve">: le stockage du contenu en Markdown brut plutôt qu'en HTML (§ 5.2.4) reste une protection indépendante de DOMPurify. Si la bibliothèque échoue, la donnée stockée n'est toujours pas du HTML exécutable.</w:t>
+        <w:t>: le stockage du contenu en Markdown brut plutôt qu'en HTML (§ 5.2) reste une protection indépendante de DOMPurify. Si la bibliothèque échoue, la donnée stockée n'est toujours pas du HTML exécutable.</w:t>
       </w:r>
     </w:p>
     <w:p>
@@ -50251,7 +50251,7 @@
         <w:t xml:space="preserve"> </w:t>
       </w:r>
       <w:r>
-        <w:t xml:space="preserve">Le RGAA 4.1.2 reste en vigueur, les déclarations publiées avant la sortie de la version 5 restent valides 18 mois, et la nouvelle version « précise ou complète » les critères sans les infirmer. L'audit d'accessibilité restant à réaliser (§ 5.1.4, § 9.7) sera donc mené sur le</w:t>
+        <w:t>Le RGAA 4.1.2 reste en vigueur, les déclarations publiées avant la sortie de la version 5 restent valides 18 mois, et la nouvelle version « précise ou complète » les critères sans les infirmer. L'audit d'accessibilité restant à réaliser (§ 5.1, § 9) sera donc mené sur le</w:t>
       </w:r>
       <w:r>
         <w:t xml:space="preserve"> </w:t>
@@ -50744,7 +50744,7 @@
         <w:t xml:space="preserve"> </w:t>
       </w:r>
       <w:r>
-        <w:t xml:space="preserve">Vérifier le code d'une dépendance ne suffit pas si l'on ne maîtrise pas la version effectivement installée. Le fichier de verrouillage devient un artefact de sécurité (§ 4.4).</w:t>
+        <w:t>Vérifier le code d'une dépendance ne suffit pas si l'on ne maîtrise pas la version effectivement installée. Le fichier de verrouillage devient un artefact de sécurité (§ 4).</w:t>
       </w:r>
     </w:p>
     <w:p>
@@ -50765,7 +50765,7 @@
         <w:t xml:space="preserve"> </w:t>
       </w:r>
       <w:r>
-        <w:t xml:space="preserve">DOMPurify corrige une faille et en introduit une autre ; seule la défense en profondeur reste stable dans le temps (§ 7.1.2).</w:t>
+        <w:t>DOMPurify corrige une faille et en introduit une autre ; seule la défense en profondeur reste stable dans le temps (§ 7.1).</w:t>
       </w:r>
     </w:p>
     <w:p>
@@ -50786,7 +50786,7 @@
         <w:t xml:space="preserve"> </w:t>
       </w:r>
       <w:r>
-        <w:t xml:space="preserve">Un cahier des charges n'est pas un contrat figé face au droit : il faut y confronter l'actualité normative, pas seulement les spécifications d'origine (§ 2.4).</w:t>
+        <w:t>Un cahier des charges n'est pas un contrat figé face au droit : il faut y confronter l'actualité normative, pas seulement les spécifications d'origine (§ 2).</w:t>
       </w:r>
     </w:p>
     <w:p>
@@ -52380,7 +52380,7 @@
         <w:pStyle w:val="BodyText"/>
       </w:pPr>
       <w:r>
-        <w:t xml:space="preserve">L'écran de création (C-07) ne montre pas l'indicateur d'enregistrement automatique : le document est vierge, le titre est vide, et le mécanisme ne s'arme qu'à partir d'un titre valide. La fonctionnalité est bien présente (§ 7.1.2) ; seule une séquence d'actions permet de l'observer, ce qui est précisément l'objet du jeu d'essai du § 10 et non d'une capture isolée.</w:t>
+        <w:t>L'écran de création (C-07) ne montre pas l'indicateur d'enregistrement automatique : le document est vierge, le titre est vide, et le mécanisme ne s'arme qu'à partir d'un titre valide. La fonctionnalité est bien présente (§ 7.1) ; seule une séquence d'actions permet de l'observer, ce qui est précisément l'objet du jeu d'essai du § 10 et non d'une capture isolée.</w:t>
       </w:r>
     </w:p>
     <w:p>
@@ -60933,7 +60933,7 @@
         <w:t xml:space="preserve">backend/database/schema_mysql.sql</w:t>
       </w:r>
       <w:r>
-        <w:t xml:space="preserve">, sept tables, MySQL 8) est versionné dans le dépôt ; ses extraits significatifs figurent en § 5.5.2. Le script de</w:t>
+        <w:t>, sept tables, MySQL 8) est versionné dans le dépôt ; ses extraits significatifs figurent en § 5.5. Le script de</w:t>
       </w:r>
       <w:r>
         <w:t xml:space="preserve"> </w:t>
@@ -60949,7 +60949,7 @@
         <w:t xml:space="preserve"> </w:t>
       </w:r>
       <w:r>
-        <w:t xml:space="preserve">est reproduit ici intégralement, car l'ordre de ses opérations porte un raisonnement (§ 5.5.3).</w:t>
+        <w:t>est reproduit ici intégralement, car l'ordre de ses opérations porte un raisonnement (§ 5.5).</w:t>
       </w:r>
     </w:p>
     <w:p>
@@ -65702,7 +65702,7 @@
         <w:t xml:space="preserve"> </w:t>
       </w:r>
       <w:r>
-        <w:t xml:space="preserve">— figure en § 6.4 et n'est pas répété ici.</w:t>
+        <w:t>— figure en § 6 et n'est pas répété ici.</w:t>
       </w:r>
     </w:p>
     <w:bookmarkEnd w:id="156"/>

</xml_diff>